<commit_message>
link git hub word
</commit_message>
<xml_diff>
--- a/documentos prueba 7/GameStore_Documentacion.docx
+++ b/documentos prueba 7/GameStore_Documentacion.docx
@@ -25,6 +25,7 @@
         <w:spacing w:after="240"/>
         <w:jc w:val="center"/>
       </w:pPr>
+      <w:proofErr w:type="spellStart"/>
       <w:r>
         <w:rPr>
           <w:b/>
@@ -35,6 +36,7 @@
         </w:rPr>
         <w:t>GameStore</w:t>
       </w:r>
+      <w:proofErr w:type="spellEnd"/>
     </w:p>
     <w:p>
       <w:pPr>
@@ -97,14 +99,190 @@
     <w:p>
       <w:pPr>
         <w:jc w:val="center"/>
-      </w:pPr>
-      <w:r>
         <w:rPr>
           <w:color w:val="64748B"/>
         </w:rPr>
+      </w:pPr>
+      <w:r>
+        <w:rPr>
+          <w:color w:val="64748B"/>
+        </w:rPr>
         <w:t>2026</w:t>
       </w:r>
     </w:p>
+    <w:p>
+      <w:pPr>
+        <w:jc w:val="center"/>
+        <w:rPr>
+          <w:color w:val="64748B"/>
+        </w:rPr>
+      </w:pPr>
+    </w:p>
+    <w:p>
+      <w:pPr>
+        <w:jc w:val="center"/>
+        <w:rPr>
+          <w:color w:val="64748B"/>
+        </w:rPr>
+      </w:pPr>
+    </w:p>
+    <w:p>
+      <w:pPr>
+        <w:jc w:val="center"/>
+        <w:rPr>
+          <w:color w:val="64748B"/>
+        </w:rPr>
+      </w:pPr>
+    </w:p>
+    <w:p>
+      <w:pPr>
+        <w:jc w:val="center"/>
+        <w:rPr>
+          <w:color w:val="64748B"/>
+        </w:rPr>
+      </w:pPr>
+    </w:p>
+    <w:p>
+      <w:pPr>
+        <w:jc w:val="center"/>
+        <w:rPr>
+          <w:color w:val="64748B"/>
+        </w:rPr>
+      </w:pPr>
+    </w:p>
+    <w:p>
+      <w:pPr>
+        <w:jc w:val="center"/>
+        <w:rPr>
+          <w:color w:val="64748B"/>
+        </w:rPr>
+      </w:pPr>
+    </w:p>
+    <w:p>
+      <w:pPr>
+        <w:jc w:val="center"/>
+        <w:rPr>
+          <w:color w:val="64748B"/>
+        </w:rPr>
+      </w:pPr>
+    </w:p>
+    <w:p>
+      <w:pPr>
+        <w:jc w:val="center"/>
+        <w:rPr>
+          <w:color w:val="64748B"/>
+        </w:rPr>
+      </w:pPr>
+    </w:p>
+    <w:p>
+      <w:pPr>
+        <w:jc w:val="center"/>
+        <w:rPr>
+          <w:color w:val="64748B"/>
+        </w:rPr>
+      </w:pPr>
+    </w:p>
+    <w:p>
+      <w:pPr>
+        <w:jc w:val="center"/>
+        <w:rPr>
+          <w:color w:val="64748B"/>
+        </w:rPr>
+      </w:pPr>
+    </w:p>
+    <w:p>
+      <w:pPr>
+        <w:jc w:val="center"/>
+        <w:rPr>
+          <w:color w:val="64748B"/>
+        </w:rPr>
+      </w:pPr>
+    </w:p>
+    <w:p>
+      <w:pPr>
+        <w:jc w:val="center"/>
+        <w:rPr>
+          <w:color w:val="64748B"/>
+        </w:rPr>
+      </w:pPr>
+    </w:p>
+    <w:p>
+      <w:pPr>
+        <w:jc w:val="center"/>
+        <w:rPr>
+          <w:color w:val="64748B"/>
+        </w:rPr>
+      </w:pPr>
+    </w:p>
+    <w:p>
+      <w:pPr>
+        <w:jc w:val="center"/>
+        <w:rPr>
+          <w:color w:val="64748B"/>
+        </w:rPr>
+      </w:pPr>
+    </w:p>
+    <w:p>
+      <w:pPr>
+        <w:jc w:val="center"/>
+        <w:rPr>
+          <w:color w:val="64748B"/>
+        </w:rPr>
+      </w:pPr>
+    </w:p>
+    <w:p>
+      <w:pPr>
+        <w:jc w:val="center"/>
+        <w:rPr>
+          <w:color w:val="64748B"/>
+        </w:rPr>
+      </w:pPr>
+    </w:p>
+    <w:p>
+      <w:pPr>
+        <w:jc w:val="center"/>
+        <w:rPr>
+          <w:color w:val="64748B"/>
+        </w:rPr>
+      </w:pPr>
+    </w:p>
+    <w:p>
+      <w:pPr>
+        <w:jc w:val="center"/>
+        <w:rPr>
+          <w:color w:val="64748B"/>
+        </w:rPr>
+      </w:pPr>
+    </w:p>
+    <w:p>
+      <w:pPr>
+        <w:jc w:val="center"/>
+        <w:rPr>
+          <w:color w:val="64748B"/>
+        </w:rPr>
+      </w:pPr>
+    </w:p>
+    <w:p>
+      <w:pPr>
+        <w:spacing w:before="80" w:after="80"/>
+      </w:pPr>
+      <w:r>
+        <w:rPr>
+          <w:color w:val="0F172A"/>
+        </w:rPr>
+        <w:t>GitHub:</w:t>
+      </w:r>
+      <w:r>
+        <w:t xml:space="preserve"> </w:t>
+      </w:r>
+      <w:r>
+        <w:rPr>
+          <w:color w:val="0F172A"/>
+        </w:rPr>
+        <w:t>https://github.com/DemWolfXZ/prueba_modulo7Django/</w:t>
+      </w:r>
+    </w:p>
+    <w:p/>
     <w:p>
       <w:r>
         <w:br w:type="page"/>
@@ -125,12 +303,43 @@
     <w:p>
       <w:pPr>
         <w:spacing w:before="80" w:after="80"/>
-      </w:pPr>
-      <w:r>
         <w:rPr>
           <w:color w:val="0F172A"/>
         </w:rPr>
-        <w:t>GameStore es una aplicación web desarrollada con Django que permite gestionar una tienda de videojuegos en línea. El sistema incluye gestión completa de clientes, juegos, plataformas y géneros, además de un sistema de compras con carrito y generación de boletas.</w:t>
+      </w:pPr>
+      <w:proofErr w:type="spellStart"/>
+      <w:r>
+        <w:rPr>
+          <w:color w:val="0F172A"/>
+        </w:rPr>
+        <w:t>GameStore</w:t>
+      </w:r>
+      <w:proofErr w:type="spellEnd"/>
+      <w:r>
+        <w:rPr>
+          <w:color w:val="0F172A"/>
+        </w:rPr>
+        <w:t xml:space="preserve"> es una aplicación web desarrollada con Django que permite gestionar una tienda de videojuegos en línea. El sistema incluye gestión completa de clientes, juegos, plataformas y géneros, además de un sistema de compras con carrito y generación de boletas.</w:t>
+      </w:r>
+    </w:p>
+    <w:p>
+      <w:pPr>
+        <w:spacing w:before="80" w:after="80"/>
+      </w:pPr>
+      <w:r>
+        <w:rPr>
+          <w:color w:val="0F172A"/>
+        </w:rPr>
+        <w:t>GitHub:</w:t>
+      </w:r>
+      <w:r>
+        <w:t xml:space="preserve"> </w:t>
+      </w:r>
+      <w:r>
+        <w:rPr>
+          <w:color w:val="0F172A"/>
+        </w:rPr>
+        <w:t>https://github.com/DemWolfXZ/prueba_modulo7Django/</w:t>
       </w:r>
     </w:p>
     <w:p>
@@ -196,7 +405,21 @@
         <w:rPr>
           <w:color w:val="0F172A"/>
         </w:rPr>
-        <w:t>Relaciones entre modelos (ForeignKey)</w:t>
+        <w:t>Relaciones entre modelos (</w:t>
+      </w:r>
+      <w:proofErr w:type="spellStart"/>
+      <w:r>
+        <w:rPr>
+          <w:color w:val="0F172A"/>
+        </w:rPr>
+        <w:t>ForeignKey</w:t>
+      </w:r>
+      <w:proofErr w:type="spellEnd"/>
+      <w:r>
+        <w:rPr>
+          <w:color w:val="0F172A"/>
+        </w:rPr>
+        <w:t>)</w:t>
       </w:r>
     </w:p>
     <w:p>
@@ -244,8 +467,16 @@
         <w:rPr>
           <w:color w:val="0F172A"/>
         </w:rPr>
-        <w:t>Integración coherente entre modelos, vistas y templates</w:t>
-      </w:r>
+        <w:t xml:space="preserve">Integración coherente entre modelos, vistas y </w:t>
+      </w:r>
+      <w:proofErr w:type="spellStart"/>
+      <w:r>
+        <w:rPr>
+          <w:color w:val="0F172A"/>
+        </w:rPr>
+        <w:t>templates</w:t>
+      </w:r>
+      <w:proofErr w:type="spellEnd"/>
     </w:p>
     <w:p>
       <w:pPr>
@@ -342,21 +573,19 @@
           <w:sz w:val="18"/>
           <w:szCs w:val="18"/>
         </w:rPr>
-        <w:t>        'ENGINE': 'django.db.backends.postgresql',</w:t>
-      </w:r>
-    </w:p>
-    <w:p>
-      <w:pPr>
-        <w:shd w:val="clear" w:color="auto" w:fill="F1F5F9"/>
-        <w:spacing w:before="80" w:after="80"/>
-        <w:ind w:left="360"/>
+        <w:t>        'ENGINE': '</w:t>
+      </w:r>
+      <w:proofErr w:type="spellStart"/>
+      <w:r>
         <w:rPr>
           <w:rFonts w:ascii="Courier New" w:eastAsia="Courier New" w:hAnsi="Courier New" w:cs="Courier New"/>
           <w:color w:val="334155"/>
           <w:sz w:val="18"/>
           <w:szCs w:val="18"/>
         </w:rPr>
-      </w:pPr>
+        <w:t>django.db.backends.postgresql</w:t>
+      </w:r>
+      <w:proofErr w:type="spellEnd"/>
       <w:r>
         <w:rPr>
           <w:rFonts w:ascii="Courier New" w:eastAsia="Courier New" w:hAnsi="Courier New" w:cs="Courier New"/>
@@ -364,7 +593,7 @@
           <w:sz w:val="18"/>
           <w:szCs w:val="18"/>
         </w:rPr>
-        <w:t>        'NAME': 'GameStore_bd',</w:t>
+        <w:t>',</w:t>
       </w:r>
     </w:p>
     <w:p>
@@ -386,7 +615,69 @@
           <w:sz w:val="18"/>
           <w:szCs w:val="18"/>
         </w:rPr>
-        <w:t>        'USER': 'postgres',</w:t>
+        <w:t>        'NAME': '</w:t>
+      </w:r>
+      <w:proofErr w:type="spellStart"/>
+      <w:r>
+        <w:rPr>
+          <w:rFonts w:ascii="Courier New" w:eastAsia="Courier New" w:hAnsi="Courier New" w:cs="Courier New"/>
+          <w:color w:val="334155"/>
+          <w:sz w:val="18"/>
+          <w:szCs w:val="18"/>
+        </w:rPr>
+        <w:t>GameStore_bd</w:t>
+      </w:r>
+      <w:proofErr w:type="spellEnd"/>
+      <w:r>
+        <w:rPr>
+          <w:rFonts w:ascii="Courier New" w:eastAsia="Courier New" w:hAnsi="Courier New" w:cs="Courier New"/>
+          <w:color w:val="334155"/>
+          <w:sz w:val="18"/>
+          <w:szCs w:val="18"/>
+        </w:rPr>
+        <w:t>',</w:t>
+      </w:r>
+    </w:p>
+    <w:p>
+      <w:pPr>
+        <w:shd w:val="clear" w:color="auto" w:fill="F1F5F9"/>
+        <w:spacing w:before="80" w:after="80"/>
+        <w:ind w:left="360"/>
+        <w:rPr>
+          <w:rFonts w:ascii="Courier New" w:eastAsia="Courier New" w:hAnsi="Courier New" w:cs="Courier New"/>
+          <w:color w:val="334155"/>
+          <w:sz w:val="18"/>
+          <w:szCs w:val="18"/>
+        </w:rPr>
+      </w:pPr>
+      <w:r>
+        <w:rPr>
+          <w:rFonts w:ascii="Courier New" w:eastAsia="Courier New" w:hAnsi="Courier New" w:cs="Courier New"/>
+          <w:color w:val="334155"/>
+          <w:sz w:val="18"/>
+          <w:szCs w:val="18"/>
+        </w:rPr>
+        <w:t>        'USER': '</w:t>
+      </w:r>
+      <w:proofErr w:type="spellStart"/>
+      <w:r>
+        <w:rPr>
+          <w:rFonts w:ascii="Courier New" w:eastAsia="Courier New" w:hAnsi="Courier New" w:cs="Courier New"/>
+          <w:color w:val="334155"/>
+          <w:sz w:val="18"/>
+          <w:szCs w:val="18"/>
+        </w:rPr>
+        <w:t>postgres</w:t>
+      </w:r>
+      <w:proofErr w:type="spellEnd"/>
+      <w:r>
+        <w:rPr>
+          <w:rFonts w:ascii="Courier New" w:eastAsia="Courier New" w:hAnsi="Courier New" w:cs="Courier New"/>
+          <w:color w:val="334155"/>
+          <w:sz w:val="18"/>
+          <w:szCs w:val="18"/>
+        </w:rPr>
+        <w:t>',</w:t>
       </w:r>
     </w:p>
     <w:p>
@@ -578,12 +869,6 @@
         <w:gridCol w:w="4026"/>
       </w:tblGrid>
       <w:tr>
-        <w:tblPrEx>
-          <w:tblCellMar>
-            <w:top w:w="0" w:type="dxa"/>
-            <w:bottom w:w="0" w:type="dxa"/>
-          </w:tblCellMar>
-        </w:tblPrEx>
         <w:trPr>
           <w:tblHeader/>
         </w:trPr>
@@ -679,12 +964,6 @@
         </w:tc>
       </w:tr>
       <w:tr>
-        <w:tblPrEx>
-          <w:tblCellMar>
-            <w:top w:w="0" w:type="dxa"/>
-            <w:bottom w:w="0" w:type="dxa"/>
-          </w:tblCellMar>
-        </w:tblPrEx>
         <w:tc>
           <w:tcPr>
             <w:tcW w:w="2200" w:type="dxa"/>
@@ -703,6 +982,7 @@
             </w:tcMar>
           </w:tcPr>
           <w:p>
+            <w:proofErr w:type="spellStart"/>
             <w:r>
               <w:rPr>
                 <w:color w:val="0F172A"/>
@@ -711,6 +991,7 @@
               </w:rPr>
               <w:t>id_cliente</w:t>
             </w:r>
+            <w:proofErr w:type="spellEnd"/>
           </w:p>
         </w:tc>
         <w:tc>
@@ -731,13 +1012,23 @@
             </w:tcMar>
           </w:tcPr>
           <w:p>
-            <w:r>
-              <w:rPr>
-                <w:color w:val="0F172A"/>
-                <w:sz w:val="20"/>
-                <w:szCs w:val="20"/>
-              </w:rPr>
-              <w:t>AutoField (PK)</w:t>
+            <w:proofErr w:type="spellStart"/>
+            <w:r>
+              <w:rPr>
+                <w:color w:val="0F172A"/>
+                <w:sz w:val="20"/>
+                <w:szCs w:val="20"/>
+              </w:rPr>
+              <w:t>AutoField</w:t>
+            </w:r>
+            <w:proofErr w:type="spellEnd"/>
+            <w:r>
+              <w:rPr>
+                <w:color w:val="0F172A"/>
+                <w:sz w:val="20"/>
+                <w:szCs w:val="20"/>
+              </w:rPr>
+              <w:t xml:space="preserve"> (PK)</w:t>
             </w:r>
           </w:p>
         </w:tc>
@@ -771,12 +1062,6 @@
         </w:tc>
       </w:tr>
       <w:tr>
-        <w:tblPrEx>
-          <w:tblCellMar>
-            <w:top w:w="0" w:type="dxa"/>
-            <w:bottom w:w="0" w:type="dxa"/>
-          </w:tblCellMar>
-        </w:tblPrEx>
         <w:tc>
           <w:tcPr>
             <w:tcW w:w="2200" w:type="dxa"/>
@@ -795,6 +1080,7 @@
             </w:tcMar>
           </w:tcPr>
           <w:p>
+            <w:proofErr w:type="spellStart"/>
             <w:r>
               <w:rPr>
                 <w:color w:val="0F172A"/>
@@ -803,6 +1089,7 @@
               </w:rPr>
               <w:t>nombre_cliente</w:t>
             </w:r>
+            <w:proofErr w:type="spellEnd"/>
           </w:p>
         </w:tc>
         <w:tc>
@@ -823,13 +1110,23 @@
             </w:tcMar>
           </w:tcPr>
           <w:p>
-            <w:r>
-              <w:rPr>
-                <w:color w:val="0F172A"/>
-                <w:sz w:val="20"/>
-                <w:szCs w:val="20"/>
-              </w:rPr>
-              <w:t>CharField(100)</w:t>
+            <w:proofErr w:type="spellStart"/>
+            <w:r>
+              <w:rPr>
+                <w:color w:val="0F172A"/>
+                <w:sz w:val="20"/>
+                <w:szCs w:val="20"/>
+              </w:rPr>
+              <w:t>CharField</w:t>
+            </w:r>
+            <w:proofErr w:type="spellEnd"/>
+            <w:r>
+              <w:rPr>
+                <w:color w:val="0F172A"/>
+                <w:sz w:val="20"/>
+                <w:szCs w:val="20"/>
+              </w:rPr>
+              <w:t>(100)</w:t>
             </w:r>
           </w:p>
         </w:tc>
@@ -863,12 +1160,6 @@
         </w:tc>
       </w:tr>
       <w:tr>
-        <w:tblPrEx>
-          <w:tblCellMar>
-            <w:top w:w="0" w:type="dxa"/>
-            <w:bottom w:w="0" w:type="dxa"/>
-          </w:tblCellMar>
-        </w:tblPrEx>
         <w:tc>
           <w:tcPr>
             <w:tcW w:w="2200" w:type="dxa"/>
@@ -893,6 +1184,7 @@
                 <w:sz w:val="20"/>
                 <w:szCs w:val="20"/>
               </w:rPr>
+              <w:lastRenderedPageBreak/>
               <w:t>correo</w:t>
             </w:r>
           </w:p>
@@ -915,13 +1207,23 @@
             </w:tcMar>
           </w:tcPr>
           <w:p>
-            <w:r>
-              <w:rPr>
-                <w:color w:val="0F172A"/>
-                <w:sz w:val="20"/>
-                <w:szCs w:val="20"/>
-              </w:rPr>
-              <w:t>EmailField(100)</w:t>
+            <w:proofErr w:type="spellStart"/>
+            <w:r>
+              <w:rPr>
+                <w:color w:val="0F172A"/>
+                <w:sz w:val="20"/>
+                <w:szCs w:val="20"/>
+              </w:rPr>
+              <w:t>EmailField</w:t>
+            </w:r>
+            <w:proofErr w:type="spellEnd"/>
+            <w:r>
+              <w:rPr>
+                <w:color w:val="0F172A"/>
+                <w:sz w:val="20"/>
+                <w:szCs w:val="20"/>
+              </w:rPr>
+              <w:t>(100)</w:t>
             </w:r>
           </w:p>
         </w:tc>
@@ -965,8 +1267,13 @@
         <w:pStyle w:val="Ttulo2"/>
       </w:pPr>
       <w:r>
-        <w:t>3.2 GeneroJuego</w:t>
-      </w:r>
+        <w:t xml:space="preserve">3.2 </w:t>
+      </w:r>
+      <w:proofErr w:type="spellStart"/>
+      <w:r>
+        <w:t>GeneroJuego</w:t>
+      </w:r>
+      <w:proofErr w:type="spellEnd"/>
     </w:p>
     <w:p>
       <w:pPr>
@@ -1007,12 +1314,6 @@
         <w:gridCol w:w="4026"/>
       </w:tblGrid>
       <w:tr>
-        <w:tblPrEx>
-          <w:tblCellMar>
-            <w:top w:w="0" w:type="dxa"/>
-            <w:bottom w:w="0" w:type="dxa"/>
-          </w:tblCellMar>
-        </w:tblPrEx>
         <w:trPr>
           <w:tblHeader/>
         </w:trPr>
@@ -1108,12 +1409,6 @@
         </w:tc>
       </w:tr>
       <w:tr>
-        <w:tblPrEx>
-          <w:tblCellMar>
-            <w:top w:w="0" w:type="dxa"/>
-            <w:bottom w:w="0" w:type="dxa"/>
-          </w:tblCellMar>
-        </w:tblPrEx>
         <w:tc>
           <w:tcPr>
             <w:tcW w:w="2200" w:type="dxa"/>
@@ -1132,6 +1427,7 @@
             </w:tcMar>
           </w:tcPr>
           <w:p>
+            <w:proofErr w:type="spellStart"/>
             <w:r>
               <w:rPr>
                 <w:color w:val="0F172A"/>
@@ -1140,6 +1436,7 @@
               </w:rPr>
               <w:t>id_genero</w:t>
             </w:r>
+            <w:proofErr w:type="spellEnd"/>
           </w:p>
         </w:tc>
         <w:tc>
@@ -1160,13 +1457,23 @@
             </w:tcMar>
           </w:tcPr>
           <w:p>
-            <w:r>
-              <w:rPr>
-                <w:color w:val="0F172A"/>
-                <w:sz w:val="20"/>
-                <w:szCs w:val="20"/>
-              </w:rPr>
-              <w:t>AutoField (PK)</w:t>
+            <w:proofErr w:type="spellStart"/>
+            <w:r>
+              <w:rPr>
+                <w:color w:val="0F172A"/>
+                <w:sz w:val="20"/>
+                <w:szCs w:val="20"/>
+              </w:rPr>
+              <w:t>AutoField</w:t>
+            </w:r>
+            <w:proofErr w:type="spellEnd"/>
+            <w:r>
+              <w:rPr>
+                <w:color w:val="0F172A"/>
+                <w:sz w:val="20"/>
+                <w:szCs w:val="20"/>
+              </w:rPr>
+              <w:t xml:space="preserve"> (PK)</w:t>
             </w:r>
           </w:p>
         </w:tc>
@@ -1200,12 +1507,6 @@
         </w:tc>
       </w:tr>
       <w:tr>
-        <w:tblPrEx>
-          <w:tblCellMar>
-            <w:top w:w="0" w:type="dxa"/>
-            <w:bottom w:w="0" w:type="dxa"/>
-          </w:tblCellMar>
-        </w:tblPrEx>
         <w:tc>
           <w:tcPr>
             <w:tcW w:w="2200" w:type="dxa"/>
@@ -1224,6 +1525,7 @@
             </w:tcMar>
           </w:tcPr>
           <w:p>
+            <w:proofErr w:type="spellStart"/>
             <w:r>
               <w:rPr>
                 <w:color w:val="0F172A"/>
@@ -1232,6 +1534,7 @@
               </w:rPr>
               <w:t>nombre_genero</w:t>
             </w:r>
+            <w:proofErr w:type="spellEnd"/>
           </w:p>
         </w:tc>
         <w:tc>
@@ -1252,13 +1555,23 @@
             </w:tcMar>
           </w:tcPr>
           <w:p>
-            <w:r>
-              <w:rPr>
-                <w:color w:val="0F172A"/>
-                <w:sz w:val="20"/>
-                <w:szCs w:val="20"/>
-              </w:rPr>
-              <w:t>CharField(50)</w:t>
+            <w:proofErr w:type="spellStart"/>
+            <w:r>
+              <w:rPr>
+                <w:color w:val="0F172A"/>
+                <w:sz w:val="20"/>
+                <w:szCs w:val="20"/>
+              </w:rPr>
+              <w:t>CharField</w:t>
+            </w:r>
+            <w:proofErr w:type="spellEnd"/>
+            <w:r>
+              <w:rPr>
+                <w:color w:val="0F172A"/>
+                <w:sz w:val="20"/>
+                <w:szCs w:val="20"/>
+              </w:rPr>
+              <w:t>(50)</w:t>
             </w:r>
           </w:p>
         </w:tc>
@@ -1344,12 +1657,6 @@
         <w:gridCol w:w="4026"/>
       </w:tblGrid>
       <w:tr>
-        <w:tblPrEx>
-          <w:tblCellMar>
-            <w:top w:w="0" w:type="dxa"/>
-            <w:bottom w:w="0" w:type="dxa"/>
-          </w:tblCellMar>
-        </w:tblPrEx>
         <w:trPr>
           <w:tblHeader/>
         </w:trPr>
@@ -1445,12 +1752,6 @@
         </w:tc>
       </w:tr>
       <w:tr>
-        <w:tblPrEx>
-          <w:tblCellMar>
-            <w:top w:w="0" w:type="dxa"/>
-            <w:bottom w:w="0" w:type="dxa"/>
-          </w:tblCellMar>
-        </w:tblPrEx>
         <w:tc>
           <w:tcPr>
             <w:tcW w:w="2200" w:type="dxa"/>
@@ -1469,6 +1770,7 @@
             </w:tcMar>
           </w:tcPr>
           <w:p>
+            <w:proofErr w:type="spellStart"/>
             <w:r>
               <w:rPr>
                 <w:color w:val="0F172A"/>
@@ -1477,6 +1779,7 @@
               </w:rPr>
               <w:t>id_plataforma</w:t>
             </w:r>
+            <w:proofErr w:type="spellEnd"/>
           </w:p>
         </w:tc>
         <w:tc>
@@ -1497,13 +1800,23 @@
             </w:tcMar>
           </w:tcPr>
           <w:p>
-            <w:r>
-              <w:rPr>
-                <w:color w:val="0F172A"/>
-                <w:sz w:val="20"/>
-                <w:szCs w:val="20"/>
-              </w:rPr>
-              <w:t>AutoField (PK)</w:t>
+            <w:proofErr w:type="spellStart"/>
+            <w:r>
+              <w:rPr>
+                <w:color w:val="0F172A"/>
+                <w:sz w:val="20"/>
+                <w:szCs w:val="20"/>
+              </w:rPr>
+              <w:t>AutoField</w:t>
+            </w:r>
+            <w:proofErr w:type="spellEnd"/>
+            <w:r>
+              <w:rPr>
+                <w:color w:val="0F172A"/>
+                <w:sz w:val="20"/>
+                <w:szCs w:val="20"/>
+              </w:rPr>
+              <w:t xml:space="preserve"> (PK)</w:t>
             </w:r>
           </w:p>
         </w:tc>
@@ -1537,12 +1850,6 @@
         </w:tc>
       </w:tr>
       <w:tr>
-        <w:tblPrEx>
-          <w:tblCellMar>
-            <w:top w:w="0" w:type="dxa"/>
-            <w:bottom w:w="0" w:type="dxa"/>
-          </w:tblCellMar>
-        </w:tblPrEx>
         <w:tc>
           <w:tcPr>
             <w:tcW w:w="2200" w:type="dxa"/>
@@ -1561,6 +1868,7 @@
             </w:tcMar>
           </w:tcPr>
           <w:p>
+            <w:proofErr w:type="spellStart"/>
             <w:r>
               <w:rPr>
                 <w:color w:val="0F172A"/>
@@ -1569,6 +1877,7 @@
               </w:rPr>
               <w:t>nombre_plataforma</w:t>
             </w:r>
+            <w:proofErr w:type="spellEnd"/>
           </w:p>
         </w:tc>
         <w:tc>
@@ -1589,13 +1898,23 @@
             </w:tcMar>
           </w:tcPr>
           <w:p>
-            <w:r>
-              <w:rPr>
-                <w:color w:val="0F172A"/>
-                <w:sz w:val="20"/>
-                <w:szCs w:val="20"/>
-              </w:rPr>
-              <w:t>CharField(50)</w:t>
+            <w:proofErr w:type="spellStart"/>
+            <w:r>
+              <w:rPr>
+                <w:color w:val="0F172A"/>
+                <w:sz w:val="20"/>
+                <w:szCs w:val="20"/>
+              </w:rPr>
+              <w:t>CharField</w:t>
+            </w:r>
+            <w:proofErr w:type="spellEnd"/>
+            <w:r>
+              <w:rPr>
+                <w:color w:val="0F172A"/>
+                <w:sz w:val="20"/>
+                <w:szCs w:val="20"/>
+              </w:rPr>
+              <w:t>(50)</w:t>
             </w:r>
           </w:p>
         </w:tc>
@@ -1681,12 +2000,6 @@
         <w:gridCol w:w="4026"/>
       </w:tblGrid>
       <w:tr>
-        <w:tblPrEx>
-          <w:tblCellMar>
-            <w:top w:w="0" w:type="dxa"/>
-            <w:bottom w:w="0" w:type="dxa"/>
-          </w:tblCellMar>
-        </w:tblPrEx>
         <w:trPr>
           <w:tblHeader/>
         </w:trPr>
@@ -1782,12 +2095,6 @@
         </w:tc>
       </w:tr>
       <w:tr>
-        <w:tblPrEx>
-          <w:tblCellMar>
-            <w:top w:w="0" w:type="dxa"/>
-            <w:bottom w:w="0" w:type="dxa"/>
-          </w:tblCellMar>
-        </w:tblPrEx>
         <w:tc>
           <w:tcPr>
             <w:tcW w:w="2200" w:type="dxa"/>
@@ -1806,6 +2113,7 @@
             </w:tcMar>
           </w:tcPr>
           <w:p>
+            <w:proofErr w:type="spellStart"/>
             <w:r>
               <w:rPr>
                 <w:color w:val="0F172A"/>
@@ -1814,6 +2122,7 @@
               </w:rPr>
               <w:t>id_juego</w:t>
             </w:r>
+            <w:proofErr w:type="spellEnd"/>
           </w:p>
         </w:tc>
         <w:tc>
@@ -1834,13 +2143,23 @@
             </w:tcMar>
           </w:tcPr>
           <w:p>
-            <w:r>
-              <w:rPr>
-                <w:color w:val="0F172A"/>
-                <w:sz w:val="20"/>
-                <w:szCs w:val="20"/>
-              </w:rPr>
-              <w:t>AutoField (PK)</w:t>
+            <w:proofErr w:type="spellStart"/>
+            <w:r>
+              <w:rPr>
+                <w:color w:val="0F172A"/>
+                <w:sz w:val="20"/>
+                <w:szCs w:val="20"/>
+              </w:rPr>
+              <w:t>AutoField</w:t>
+            </w:r>
+            <w:proofErr w:type="spellEnd"/>
+            <w:r>
+              <w:rPr>
+                <w:color w:val="0F172A"/>
+                <w:sz w:val="20"/>
+                <w:szCs w:val="20"/>
+              </w:rPr>
+              <w:t xml:space="preserve"> (PK)</w:t>
             </w:r>
           </w:p>
         </w:tc>
@@ -1874,12 +2193,6 @@
         </w:tc>
       </w:tr>
       <w:tr>
-        <w:tblPrEx>
-          <w:tblCellMar>
-            <w:top w:w="0" w:type="dxa"/>
-            <w:bottom w:w="0" w:type="dxa"/>
-          </w:tblCellMar>
-        </w:tblPrEx>
         <w:tc>
           <w:tcPr>
             <w:tcW w:w="2200" w:type="dxa"/>
@@ -1898,6 +2211,7 @@
             </w:tcMar>
           </w:tcPr>
           <w:p>
+            <w:proofErr w:type="spellStart"/>
             <w:r>
               <w:rPr>
                 <w:color w:val="0F172A"/>
@@ -1906,6 +2220,7 @@
               </w:rPr>
               <w:t>nombre_juego</w:t>
             </w:r>
+            <w:proofErr w:type="spellEnd"/>
           </w:p>
         </w:tc>
         <w:tc>
@@ -1926,13 +2241,23 @@
             </w:tcMar>
           </w:tcPr>
           <w:p>
-            <w:r>
-              <w:rPr>
-                <w:color w:val="0F172A"/>
-                <w:sz w:val="20"/>
-                <w:szCs w:val="20"/>
-              </w:rPr>
-              <w:t>CharField(100)</w:t>
+            <w:proofErr w:type="spellStart"/>
+            <w:r>
+              <w:rPr>
+                <w:color w:val="0F172A"/>
+                <w:sz w:val="20"/>
+                <w:szCs w:val="20"/>
+              </w:rPr>
+              <w:t>CharField</w:t>
+            </w:r>
+            <w:proofErr w:type="spellEnd"/>
+            <w:r>
+              <w:rPr>
+                <w:color w:val="0F172A"/>
+                <w:sz w:val="20"/>
+                <w:szCs w:val="20"/>
+              </w:rPr>
+              <w:t>(100)</w:t>
             </w:r>
           </w:p>
         </w:tc>
@@ -1966,12 +2291,6 @@
         </w:tc>
       </w:tr>
       <w:tr>
-        <w:tblPrEx>
-          <w:tblCellMar>
-            <w:top w:w="0" w:type="dxa"/>
-            <w:bottom w:w="0" w:type="dxa"/>
-          </w:tblCellMar>
-        </w:tblPrEx>
         <w:tc>
           <w:tcPr>
             <w:tcW w:w="2200" w:type="dxa"/>
@@ -2018,13 +2337,41 @@
             </w:tcMar>
           </w:tcPr>
           <w:p>
-            <w:r>
-              <w:rPr>
-                <w:color w:val="0F172A"/>
-                <w:sz w:val="20"/>
-                <w:szCs w:val="20"/>
-              </w:rPr>
-              <w:t>ForeignKey(GeneroJuego)</w:t>
+            <w:proofErr w:type="spellStart"/>
+            <w:r>
+              <w:rPr>
+                <w:color w:val="0F172A"/>
+                <w:sz w:val="20"/>
+                <w:szCs w:val="20"/>
+              </w:rPr>
+              <w:t>ForeignKey</w:t>
+            </w:r>
+            <w:proofErr w:type="spellEnd"/>
+            <w:r>
+              <w:rPr>
+                <w:color w:val="0F172A"/>
+                <w:sz w:val="20"/>
+                <w:szCs w:val="20"/>
+              </w:rPr>
+              <w:t>(</w:t>
+            </w:r>
+            <w:proofErr w:type="spellStart"/>
+            <w:r>
+              <w:rPr>
+                <w:color w:val="0F172A"/>
+                <w:sz w:val="20"/>
+                <w:szCs w:val="20"/>
+              </w:rPr>
+              <w:t>GeneroJuego</w:t>
+            </w:r>
+            <w:proofErr w:type="spellEnd"/>
+            <w:r>
+              <w:rPr>
+                <w:color w:val="0F172A"/>
+                <w:sz w:val="20"/>
+                <w:szCs w:val="20"/>
+              </w:rPr>
+              <w:t>)</w:t>
             </w:r>
           </w:p>
         </w:tc>
@@ -2058,12 +2405,6 @@
         </w:tc>
       </w:tr>
       <w:tr>
-        <w:tblPrEx>
-          <w:tblCellMar>
-            <w:top w:w="0" w:type="dxa"/>
-            <w:bottom w:w="0" w:type="dxa"/>
-          </w:tblCellMar>
-        </w:tblPrEx>
         <w:tc>
           <w:tcPr>
             <w:tcW w:w="2200" w:type="dxa"/>
@@ -2110,13 +2451,23 @@
             </w:tcMar>
           </w:tcPr>
           <w:p>
-            <w:r>
-              <w:rPr>
-                <w:color w:val="0F172A"/>
-                <w:sz w:val="20"/>
-                <w:szCs w:val="20"/>
-              </w:rPr>
-              <w:t>ForeignKey(Plataforma)</w:t>
+            <w:proofErr w:type="spellStart"/>
+            <w:r>
+              <w:rPr>
+                <w:color w:val="0F172A"/>
+                <w:sz w:val="20"/>
+                <w:szCs w:val="20"/>
+              </w:rPr>
+              <w:t>ForeignKey</w:t>
+            </w:r>
+            <w:proofErr w:type="spellEnd"/>
+            <w:r>
+              <w:rPr>
+                <w:color w:val="0F172A"/>
+                <w:sz w:val="20"/>
+                <w:szCs w:val="20"/>
+              </w:rPr>
+              <w:t>(Plataforma)</w:t>
             </w:r>
           </w:p>
         </w:tc>
@@ -2150,12 +2501,6 @@
         </w:tc>
       </w:tr>
       <w:tr>
-        <w:tblPrEx>
-          <w:tblCellMar>
-            <w:top w:w="0" w:type="dxa"/>
-            <w:bottom w:w="0" w:type="dxa"/>
-          </w:tblCellMar>
-        </w:tblPrEx>
         <w:tc>
           <w:tcPr>
             <w:tcW w:w="2200" w:type="dxa"/>
@@ -2202,13 +2547,23 @@
             </w:tcMar>
           </w:tcPr>
           <w:p>
-            <w:r>
-              <w:rPr>
-                <w:color w:val="0F172A"/>
-                <w:sz w:val="20"/>
-                <w:szCs w:val="20"/>
-              </w:rPr>
-              <w:t>DecimalField(10,2)</w:t>
+            <w:proofErr w:type="spellStart"/>
+            <w:r>
+              <w:rPr>
+                <w:color w:val="0F172A"/>
+                <w:sz w:val="20"/>
+                <w:szCs w:val="20"/>
+              </w:rPr>
+              <w:t>DecimalField</w:t>
+            </w:r>
+            <w:proofErr w:type="spellEnd"/>
+            <w:r>
+              <w:rPr>
+                <w:color w:val="0F172A"/>
+                <w:sz w:val="20"/>
+                <w:szCs w:val="20"/>
+              </w:rPr>
+              <w:t>(10,2)</w:t>
             </w:r>
           </w:p>
         </w:tc>
@@ -2242,12 +2597,6 @@
         </w:tc>
       </w:tr>
       <w:tr>
-        <w:tblPrEx>
-          <w:tblCellMar>
-            <w:top w:w="0" w:type="dxa"/>
-            <w:bottom w:w="0" w:type="dxa"/>
-          </w:tblCellMar>
-        </w:tblPrEx>
         <w:tc>
           <w:tcPr>
             <w:tcW w:w="2200" w:type="dxa"/>
@@ -2266,6 +2615,7 @@
             </w:tcMar>
           </w:tcPr>
           <w:p>
+            <w:proofErr w:type="spellStart"/>
             <w:r>
               <w:rPr>
                 <w:color w:val="0F172A"/>
@@ -2274,6 +2624,7 @@
               </w:rPr>
               <w:t>descripcion</w:t>
             </w:r>
+            <w:proofErr w:type="spellEnd"/>
           </w:p>
         </w:tc>
         <w:tc>
@@ -2294,6 +2645,7 @@
             </w:tcMar>
           </w:tcPr>
           <w:p>
+            <w:proofErr w:type="spellStart"/>
             <w:r>
               <w:rPr>
                 <w:color w:val="0F172A"/>
@@ -2302,6 +2654,7 @@
               </w:rPr>
               <w:t>TextField</w:t>
             </w:r>
+            <w:proofErr w:type="spellEnd"/>
           </w:p>
         </w:tc>
         <w:tc>
@@ -2334,12 +2687,6 @@
         </w:tc>
       </w:tr>
       <w:tr>
-        <w:tblPrEx>
-          <w:tblCellMar>
-            <w:top w:w="0" w:type="dxa"/>
-            <w:bottom w:w="0" w:type="dxa"/>
-          </w:tblCellMar>
-        </w:tblPrEx>
         <w:tc>
           <w:tcPr>
             <w:tcW w:w="2200" w:type="dxa"/>
@@ -2386,6 +2733,7 @@
             </w:tcMar>
           </w:tcPr>
           <w:p>
+            <w:proofErr w:type="spellStart"/>
             <w:r>
               <w:rPr>
                 <w:color w:val="0F172A"/>
@@ -2394,6 +2742,7 @@
               </w:rPr>
               <w:t>ImageField</w:t>
             </w:r>
+            <w:proofErr w:type="spellEnd"/>
           </w:p>
         </w:tc>
         <w:tc>
@@ -2478,12 +2827,6 @@
         <w:gridCol w:w="4026"/>
       </w:tblGrid>
       <w:tr>
-        <w:tblPrEx>
-          <w:tblCellMar>
-            <w:top w:w="0" w:type="dxa"/>
-            <w:bottom w:w="0" w:type="dxa"/>
-          </w:tblCellMar>
-        </w:tblPrEx>
         <w:trPr>
           <w:tblHeader/>
         </w:trPr>
@@ -2579,12 +2922,6 @@
         </w:tc>
       </w:tr>
       <w:tr>
-        <w:tblPrEx>
-          <w:tblCellMar>
-            <w:top w:w="0" w:type="dxa"/>
-            <w:bottom w:w="0" w:type="dxa"/>
-          </w:tblCellMar>
-        </w:tblPrEx>
         <w:tc>
           <w:tcPr>
             <w:tcW w:w="2200" w:type="dxa"/>
@@ -2603,6 +2940,7 @@
             </w:tcMar>
           </w:tcPr>
           <w:p>
+            <w:proofErr w:type="spellStart"/>
             <w:r>
               <w:rPr>
                 <w:color w:val="0F172A"/>
@@ -2611,6 +2949,7 @@
               </w:rPr>
               <w:t>id_boleta</w:t>
             </w:r>
+            <w:proofErr w:type="spellEnd"/>
           </w:p>
         </w:tc>
         <w:tc>
@@ -2631,13 +2970,23 @@
             </w:tcMar>
           </w:tcPr>
           <w:p>
-            <w:r>
-              <w:rPr>
-                <w:color w:val="0F172A"/>
-                <w:sz w:val="20"/>
-                <w:szCs w:val="20"/>
-              </w:rPr>
-              <w:t>AutoField (PK)</w:t>
+            <w:proofErr w:type="spellStart"/>
+            <w:r>
+              <w:rPr>
+                <w:color w:val="0F172A"/>
+                <w:sz w:val="20"/>
+                <w:szCs w:val="20"/>
+              </w:rPr>
+              <w:t>AutoField</w:t>
+            </w:r>
+            <w:proofErr w:type="spellEnd"/>
+            <w:r>
+              <w:rPr>
+                <w:color w:val="0F172A"/>
+                <w:sz w:val="20"/>
+                <w:szCs w:val="20"/>
+              </w:rPr>
+              <w:t xml:space="preserve"> (PK)</w:t>
             </w:r>
           </w:p>
         </w:tc>
@@ -2671,12 +3020,6 @@
         </w:tc>
       </w:tr>
       <w:tr>
-        <w:tblPrEx>
-          <w:tblCellMar>
-            <w:top w:w="0" w:type="dxa"/>
-            <w:bottom w:w="0" w:type="dxa"/>
-          </w:tblCellMar>
-        </w:tblPrEx>
         <w:tc>
           <w:tcPr>
             <w:tcW w:w="2200" w:type="dxa"/>
@@ -2701,6 +3044,7 @@
                 <w:sz w:val="20"/>
                 <w:szCs w:val="20"/>
               </w:rPr>
+              <w:lastRenderedPageBreak/>
               <w:t>cliente</w:t>
             </w:r>
           </w:p>
@@ -2723,13 +3067,23 @@
             </w:tcMar>
           </w:tcPr>
           <w:p>
-            <w:r>
-              <w:rPr>
-                <w:color w:val="0F172A"/>
-                <w:sz w:val="20"/>
-                <w:szCs w:val="20"/>
-              </w:rPr>
-              <w:t>ForeignKey(Cliente)</w:t>
+            <w:proofErr w:type="spellStart"/>
+            <w:r>
+              <w:rPr>
+                <w:color w:val="0F172A"/>
+                <w:sz w:val="20"/>
+                <w:szCs w:val="20"/>
+              </w:rPr>
+              <w:t>ForeignKey</w:t>
+            </w:r>
+            <w:proofErr w:type="spellEnd"/>
+            <w:r>
+              <w:rPr>
+                <w:color w:val="0F172A"/>
+                <w:sz w:val="20"/>
+                <w:szCs w:val="20"/>
+              </w:rPr>
+              <w:t>(Cliente)</w:t>
             </w:r>
           </w:p>
         </w:tc>
@@ -2763,12 +3117,6 @@
         </w:tc>
       </w:tr>
       <w:tr>
-        <w:tblPrEx>
-          <w:tblCellMar>
-            <w:top w:w="0" w:type="dxa"/>
-            <w:bottom w:w="0" w:type="dxa"/>
-          </w:tblCellMar>
-        </w:tblPrEx>
         <w:tc>
           <w:tcPr>
             <w:tcW w:w="2200" w:type="dxa"/>
@@ -2787,6 +3135,7 @@
             </w:tcMar>
           </w:tcPr>
           <w:p>
+            <w:proofErr w:type="spellStart"/>
             <w:r>
               <w:rPr>
                 <w:color w:val="0F172A"/>
@@ -2795,6 +3144,7 @@
               </w:rPr>
               <w:t>fecha_compra</w:t>
             </w:r>
+            <w:proofErr w:type="spellEnd"/>
           </w:p>
         </w:tc>
         <w:tc>
@@ -2815,6 +3165,7 @@
             </w:tcMar>
           </w:tcPr>
           <w:p>
+            <w:proofErr w:type="spellStart"/>
             <w:r>
               <w:rPr>
                 <w:color w:val="0F172A"/>
@@ -2823,6 +3174,7 @@
               </w:rPr>
               <w:t>DateTimeField</w:t>
             </w:r>
+            <w:proofErr w:type="spellEnd"/>
           </w:p>
         </w:tc>
         <w:tc>
@@ -2855,12 +3207,6 @@
         </w:tc>
       </w:tr>
       <w:tr>
-        <w:tblPrEx>
-          <w:tblCellMar>
-            <w:top w:w="0" w:type="dxa"/>
-            <w:bottom w:w="0" w:type="dxa"/>
-          </w:tblCellMar>
-        </w:tblPrEx>
         <w:tc>
           <w:tcPr>
             <w:tcW w:w="2200" w:type="dxa"/>
@@ -2879,15 +3225,16 @@
             </w:tcMar>
           </w:tcPr>
           <w:p>
-            <w:r>
-              <w:rPr>
-                <w:color w:val="0F172A"/>
-                <w:sz w:val="20"/>
-                <w:szCs w:val="20"/>
-              </w:rPr>
-              <w:lastRenderedPageBreak/>
+            <w:proofErr w:type="spellStart"/>
+            <w:r>
+              <w:rPr>
+                <w:color w:val="0F172A"/>
+                <w:sz w:val="20"/>
+                <w:szCs w:val="20"/>
+              </w:rPr>
               <w:t>total_boleta</w:t>
             </w:r>
+            <w:proofErr w:type="spellEnd"/>
           </w:p>
         </w:tc>
         <w:tc>
@@ -2908,13 +3255,23 @@
             </w:tcMar>
           </w:tcPr>
           <w:p>
-            <w:r>
-              <w:rPr>
-                <w:color w:val="0F172A"/>
-                <w:sz w:val="20"/>
-                <w:szCs w:val="20"/>
-              </w:rPr>
-              <w:t>DecimalField(10,2)</w:t>
+            <w:proofErr w:type="spellStart"/>
+            <w:r>
+              <w:rPr>
+                <w:color w:val="0F172A"/>
+                <w:sz w:val="20"/>
+                <w:szCs w:val="20"/>
+              </w:rPr>
+              <w:t>DecimalField</w:t>
+            </w:r>
+            <w:proofErr w:type="spellEnd"/>
+            <w:r>
+              <w:rPr>
+                <w:color w:val="0F172A"/>
+                <w:sz w:val="20"/>
+                <w:szCs w:val="20"/>
+              </w:rPr>
+              <w:t>(10,2)</w:t>
             </w:r>
           </w:p>
         </w:tc>
@@ -2958,8 +3315,13 @@
         <w:pStyle w:val="Ttulo2"/>
       </w:pPr>
       <w:r>
-        <w:t>3.6 DetalleBoleta</w:t>
-      </w:r>
+        <w:t xml:space="preserve">3.6 </w:t>
+      </w:r>
+      <w:proofErr w:type="spellStart"/>
+      <w:r>
+        <w:t>DetalleBoleta</w:t>
+      </w:r>
+      <w:proofErr w:type="spellEnd"/>
     </w:p>
     <w:p>
       <w:pPr>
@@ -3000,12 +3362,6 @@
         <w:gridCol w:w="4026"/>
       </w:tblGrid>
       <w:tr>
-        <w:tblPrEx>
-          <w:tblCellMar>
-            <w:top w:w="0" w:type="dxa"/>
-            <w:bottom w:w="0" w:type="dxa"/>
-          </w:tblCellMar>
-        </w:tblPrEx>
         <w:trPr>
           <w:tblHeader/>
         </w:trPr>
@@ -3101,12 +3457,6 @@
         </w:tc>
       </w:tr>
       <w:tr>
-        <w:tblPrEx>
-          <w:tblCellMar>
-            <w:top w:w="0" w:type="dxa"/>
-            <w:bottom w:w="0" w:type="dxa"/>
-          </w:tblCellMar>
-        </w:tblPrEx>
         <w:tc>
           <w:tcPr>
             <w:tcW w:w="2200" w:type="dxa"/>
@@ -3125,6 +3475,7 @@
             </w:tcMar>
           </w:tcPr>
           <w:p>
+            <w:proofErr w:type="spellStart"/>
             <w:r>
               <w:rPr>
                 <w:color w:val="0F172A"/>
@@ -3133,6 +3484,7 @@
               </w:rPr>
               <w:t>id_detalle</w:t>
             </w:r>
+            <w:proofErr w:type="spellEnd"/>
           </w:p>
         </w:tc>
         <w:tc>
@@ -3153,13 +3505,23 @@
             </w:tcMar>
           </w:tcPr>
           <w:p>
-            <w:r>
-              <w:rPr>
-                <w:color w:val="0F172A"/>
-                <w:sz w:val="20"/>
-                <w:szCs w:val="20"/>
-              </w:rPr>
-              <w:t>AutoField (PK)</w:t>
+            <w:proofErr w:type="spellStart"/>
+            <w:r>
+              <w:rPr>
+                <w:color w:val="0F172A"/>
+                <w:sz w:val="20"/>
+                <w:szCs w:val="20"/>
+              </w:rPr>
+              <w:t>AutoField</w:t>
+            </w:r>
+            <w:proofErr w:type="spellEnd"/>
+            <w:r>
+              <w:rPr>
+                <w:color w:val="0F172A"/>
+                <w:sz w:val="20"/>
+                <w:szCs w:val="20"/>
+              </w:rPr>
+              <w:t xml:space="preserve"> (PK)</w:t>
             </w:r>
           </w:p>
         </w:tc>
@@ -3193,12 +3555,6 @@
         </w:tc>
       </w:tr>
       <w:tr>
-        <w:tblPrEx>
-          <w:tblCellMar>
-            <w:top w:w="0" w:type="dxa"/>
-            <w:bottom w:w="0" w:type="dxa"/>
-          </w:tblCellMar>
-        </w:tblPrEx>
         <w:tc>
           <w:tcPr>
             <w:tcW w:w="2200" w:type="dxa"/>
@@ -3245,13 +3601,23 @@
             </w:tcMar>
           </w:tcPr>
           <w:p>
-            <w:r>
-              <w:rPr>
-                <w:color w:val="0F172A"/>
-                <w:sz w:val="20"/>
-                <w:szCs w:val="20"/>
-              </w:rPr>
-              <w:t>ForeignKey(Boleta)</w:t>
+            <w:proofErr w:type="spellStart"/>
+            <w:r>
+              <w:rPr>
+                <w:color w:val="0F172A"/>
+                <w:sz w:val="20"/>
+                <w:szCs w:val="20"/>
+              </w:rPr>
+              <w:t>ForeignKey</w:t>
+            </w:r>
+            <w:proofErr w:type="spellEnd"/>
+            <w:r>
+              <w:rPr>
+                <w:color w:val="0F172A"/>
+                <w:sz w:val="20"/>
+                <w:szCs w:val="20"/>
+              </w:rPr>
+              <w:t>(Boleta)</w:t>
             </w:r>
           </w:p>
         </w:tc>
@@ -3285,12 +3651,6 @@
         </w:tc>
       </w:tr>
       <w:tr>
-        <w:tblPrEx>
-          <w:tblCellMar>
-            <w:top w:w="0" w:type="dxa"/>
-            <w:bottom w:w="0" w:type="dxa"/>
-          </w:tblCellMar>
-        </w:tblPrEx>
         <w:tc>
           <w:tcPr>
             <w:tcW w:w="2200" w:type="dxa"/>
@@ -3337,13 +3697,23 @@
             </w:tcMar>
           </w:tcPr>
           <w:p>
-            <w:r>
-              <w:rPr>
-                <w:color w:val="0F172A"/>
-                <w:sz w:val="20"/>
-                <w:szCs w:val="20"/>
-              </w:rPr>
-              <w:t>ForeignKey(Juego)</w:t>
+            <w:proofErr w:type="spellStart"/>
+            <w:r>
+              <w:rPr>
+                <w:color w:val="0F172A"/>
+                <w:sz w:val="20"/>
+                <w:szCs w:val="20"/>
+              </w:rPr>
+              <w:t>ForeignKey</w:t>
+            </w:r>
+            <w:proofErr w:type="spellEnd"/>
+            <w:r>
+              <w:rPr>
+                <w:color w:val="0F172A"/>
+                <w:sz w:val="20"/>
+                <w:szCs w:val="20"/>
+              </w:rPr>
+              <w:t>(Juego)</w:t>
             </w:r>
           </w:p>
         </w:tc>
@@ -3377,12 +3747,6 @@
         </w:tc>
       </w:tr>
       <w:tr>
-        <w:tblPrEx>
-          <w:tblCellMar>
-            <w:top w:w="0" w:type="dxa"/>
-            <w:bottom w:w="0" w:type="dxa"/>
-          </w:tblCellMar>
-        </w:tblPrEx>
         <w:tc>
           <w:tcPr>
             <w:tcW w:w="2200" w:type="dxa"/>
@@ -3429,6 +3793,7 @@
             </w:tcMar>
           </w:tcPr>
           <w:p>
+            <w:proofErr w:type="spellStart"/>
             <w:r>
               <w:rPr>
                 <w:color w:val="0F172A"/>
@@ -3437,6 +3802,7 @@
               </w:rPr>
               <w:t>PositiveIntegerField</w:t>
             </w:r>
+            <w:proofErr w:type="spellEnd"/>
           </w:p>
         </w:tc>
         <w:tc>
@@ -3469,12 +3835,6 @@
         </w:tc>
       </w:tr>
       <w:tr>
-        <w:tblPrEx>
-          <w:tblCellMar>
-            <w:top w:w="0" w:type="dxa"/>
-            <w:bottom w:w="0" w:type="dxa"/>
-          </w:tblCellMar>
-        </w:tblPrEx>
         <w:tc>
           <w:tcPr>
             <w:tcW w:w="2200" w:type="dxa"/>
@@ -3493,6 +3853,7 @@
             </w:tcMar>
           </w:tcPr>
           <w:p>
+            <w:proofErr w:type="spellStart"/>
             <w:r>
               <w:rPr>
                 <w:color w:val="0F172A"/>
@@ -3501,6 +3862,7 @@
               </w:rPr>
               <w:t>precio_unitario</w:t>
             </w:r>
+            <w:proofErr w:type="spellEnd"/>
           </w:p>
         </w:tc>
         <w:tc>
@@ -3521,13 +3883,23 @@
             </w:tcMar>
           </w:tcPr>
           <w:p>
-            <w:r>
-              <w:rPr>
-                <w:color w:val="0F172A"/>
-                <w:sz w:val="20"/>
-                <w:szCs w:val="20"/>
-              </w:rPr>
-              <w:t>DecimalField(10,2)</w:t>
+            <w:proofErr w:type="spellStart"/>
+            <w:r>
+              <w:rPr>
+                <w:color w:val="0F172A"/>
+                <w:sz w:val="20"/>
+                <w:szCs w:val="20"/>
+              </w:rPr>
+              <w:t>DecimalField</w:t>
+            </w:r>
+            <w:proofErr w:type="spellEnd"/>
+            <w:r>
+              <w:rPr>
+                <w:color w:val="0F172A"/>
+                <w:sz w:val="20"/>
+                <w:szCs w:val="20"/>
+              </w:rPr>
+              <w:t>(10,2)</w:t>
             </w:r>
           </w:p>
         </w:tc>
@@ -3561,12 +3933,6 @@
         </w:tc>
       </w:tr>
       <w:tr>
-        <w:tblPrEx>
-          <w:tblCellMar>
-            <w:top w:w="0" w:type="dxa"/>
-            <w:bottom w:w="0" w:type="dxa"/>
-          </w:tblCellMar>
-        </w:tblPrEx>
         <w:tc>
           <w:tcPr>
             <w:tcW w:w="2200" w:type="dxa"/>
@@ -3613,13 +3979,23 @@
             </w:tcMar>
           </w:tcPr>
           <w:p>
-            <w:r>
-              <w:rPr>
-                <w:color w:val="0F172A"/>
-                <w:sz w:val="20"/>
-                <w:szCs w:val="20"/>
-              </w:rPr>
-              <w:t>DecimalField(10,2)</w:t>
+            <w:proofErr w:type="spellStart"/>
+            <w:r>
+              <w:rPr>
+                <w:color w:val="0F172A"/>
+                <w:sz w:val="20"/>
+                <w:szCs w:val="20"/>
+              </w:rPr>
+              <w:t>DecimalField</w:t>
+            </w:r>
+            <w:proofErr w:type="spellEnd"/>
+            <w:r>
+              <w:rPr>
+                <w:color w:val="0F172A"/>
+                <w:sz w:val="20"/>
+                <w:szCs w:val="20"/>
+              </w:rPr>
+              <w:t>(10,2)</w:t>
             </w:r>
           </w:p>
         </w:tc>
@@ -3641,13 +4017,23 @@
             </w:tcMar>
           </w:tcPr>
           <w:p>
-            <w:r>
-              <w:rPr>
-                <w:color w:val="0F172A"/>
-                <w:sz w:val="20"/>
-                <w:szCs w:val="20"/>
-              </w:rPr>
-              <w:t>precio_unitario × cantidad</w:t>
+            <w:proofErr w:type="spellStart"/>
+            <w:r>
+              <w:rPr>
+                <w:color w:val="0F172A"/>
+                <w:sz w:val="20"/>
+                <w:szCs w:val="20"/>
+              </w:rPr>
+              <w:t>precio_unitario</w:t>
+            </w:r>
+            <w:proofErr w:type="spellEnd"/>
+            <w:r>
+              <w:rPr>
+                <w:color w:val="0F172A"/>
+                <w:sz w:val="20"/>
+                <w:szCs w:val="20"/>
+              </w:rPr>
+              <w:t xml:space="preserve"> × cantidad</w:t>
             </w:r>
           </w:p>
         </w:tc>
@@ -3684,15 +4070,9 @@
           <w:sz w:val="18"/>
           <w:szCs w:val="18"/>
         </w:rPr>
-        <w:t>Cliente ──────────────── Boleta ──────────── DetalleBoleta</w:t>
-      </w:r>
-    </w:p>
-    <w:p>
-      <w:pPr>
-        <w:shd w:val="clear" w:color="auto" w:fill="F1F5F9"/>
-        <w:spacing w:before="80" w:after="80"/>
-        <w:ind w:left="360"/>
-      </w:pPr>
+        <w:t xml:space="preserve">Cliente ──────────────── Boleta ──────────── </w:t>
+      </w:r>
+      <w:proofErr w:type="spellStart"/>
       <w:r>
         <w:rPr>
           <w:rFonts w:ascii="Courier New" w:eastAsia="Courier New" w:hAnsi="Courier New" w:cs="Courier New"/>
@@ -3700,8 +4080,9 @@
           <w:sz w:val="18"/>
           <w:szCs w:val="18"/>
         </w:rPr>
-        <w:t xml:space="preserve">                                                    │</w:t>
-      </w:r>
+        <w:t>DetalleBoleta</w:t>
+      </w:r>
+      <w:proofErr w:type="spellEnd"/>
     </w:p>
     <w:p>
       <w:pPr>
@@ -3716,7 +4097,7 @@
           <w:sz w:val="18"/>
           <w:szCs w:val="18"/>
         </w:rPr>
-        <w:t>GeneroJuego ──┐                                     │</w:t>
+        <w:t xml:space="preserve">                                                    │</w:t>
       </w:r>
     </w:p>
     <w:p>
@@ -3725,6 +4106,7 @@
         <w:spacing w:before="80" w:after="80"/>
         <w:ind w:left="360"/>
       </w:pPr>
+      <w:proofErr w:type="spellStart"/>
       <w:r>
         <w:rPr>
           <w:rFonts w:ascii="Courier New" w:eastAsia="Courier New" w:hAnsi="Courier New" w:cs="Courier New"/>
@@ -3732,15 +4114,9 @@
           <w:sz w:val="18"/>
           <w:szCs w:val="18"/>
         </w:rPr>
-        <w:t xml:space="preserve">              ├──── Juego ────────────────────────┘</w:t>
-      </w:r>
-    </w:p>
-    <w:p>
-      <w:pPr>
-        <w:shd w:val="clear" w:color="auto" w:fill="F1F5F9"/>
-        <w:spacing w:before="80" w:after="80"/>
-        <w:ind w:left="360"/>
-      </w:pPr>
+        <w:t>GeneroJuego</w:t>
+      </w:r>
+      <w:proofErr w:type="spellEnd"/>
       <w:r>
         <w:rPr>
           <w:rFonts w:ascii="Courier New" w:eastAsia="Courier New" w:hAnsi="Courier New" w:cs="Courier New"/>
@@ -3748,6 +4124,38 @@
           <w:sz w:val="18"/>
           <w:szCs w:val="18"/>
         </w:rPr>
+        <w:t xml:space="preserve"> ──┐                                     │</w:t>
+      </w:r>
+    </w:p>
+    <w:p>
+      <w:pPr>
+        <w:shd w:val="clear" w:color="auto" w:fill="F1F5F9"/>
+        <w:spacing w:before="80" w:after="80"/>
+        <w:ind w:left="360"/>
+      </w:pPr>
+      <w:r>
+        <w:rPr>
+          <w:rFonts w:ascii="Courier New" w:eastAsia="Courier New" w:hAnsi="Courier New" w:cs="Courier New"/>
+          <w:color w:val="334155"/>
+          <w:sz w:val="18"/>
+          <w:szCs w:val="18"/>
+        </w:rPr>
+        <w:t xml:space="preserve">              ├──── Juego ────────────────────────┘</w:t>
+      </w:r>
+    </w:p>
+    <w:p>
+      <w:pPr>
+        <w:shd w:val="clear" w:color="auto" w:fill="F1F5F9"/>
+        <w:spacing w:before="80" w:after="80"/>
+        <w:ind w:left="360"/>
+      </w:pPr>
+      <w:r>
+        <w:rPr>
+          <w:rFonts w:ascii="Courier New" w:eastAsia="Courier New" w:hAnsi="Courier New" w:cs="Courier New"/>
+          <w:color w:val="334155"/>
+          <w:sz w:val="18"/>
+          <w:szCs w:val="18"/>
+        </w:rPr>
         <w:t>Plataforma  ──┘</w:t>
       </w:r>
     </w:p>
@@ -3795,6 +4203,7 @@
         <w:spacing w:before="80" w:after="80"/>
         <w:ind w:left="360"/>
       </w:pPr>
+      <w:proofErr w:type="spellStart"/>
       <w:r>
         <w:rPr>
           <w:rFonts w:ascii="Courier New" w:eastAsia="Courier New" w:hAnsi="Courier New" w:cs="Courier New"/>
@@ -3802,15 +4211,9 @@
           <w:sz w:val="18"/>
           <w:szCs w:val="18"/>
         </w:rPr>
-        <w:t>python manage.py makemigrations</w:t>
-      </w:r>
-    </w:p>
-    <w:p>
-      <w:pPr>
-        <w:shd w:val="clear" w:color="auto" w:fill="F1F5F9"/>
-        <w:spacing w:before="80" w:after="80"/>
-        <w:ind w:left="360"/>
-      </w:pPr>
+        <w:t>python</w:t>
+      </w:r>
+      <w:proofErr w:type="spellEnd"/>
       <w:r>
         <w:rPr>
           <w:rFonts w:ascii="Courier New" w:eastAsia="Courier New" w:hAnsi="Courier New" w:cs="Courier New"/>
@@ -3818,8 +4221,57 @@
           <w:sz w:val="18"/>
           <w:szCs w:val="18"/>
         </w:rPr>
-        <w:t>python manage.py migrate</w:t>
-      </w:r>
+        <w:t xml:space="preserve"> manage.py </w:t>
+      </w:r>
+      <w:proofErr w:type="spellStart"/>
+      <w:r>
+        <w:rPr>
+          <w:rFonts w:ascii="Courier New" w:eastAsia="Courier New" w:hAnsi="Courier New" w:cs="Courier New"/>
+          <w:color w:val="334155"/>
+          <w:sz w:val="18"/>
+          <w:szCs w:val="18"/>
+        </w:rPr>
+        <w:t>makemigrations</w:t>
+      </w:r>
+      <w:proofErr w:type="spellEnd"/>
+    </w:p>
+    <w:p>
+      <w:pPr>
+        <w:shd w:val="clear" w:color="auto" w:fill="F1F5F9"/>
+        <w:spacing w:before="80" w:after="80"/>
+        <w:ind w:left="360"/>
+      </w:pPr>
+      <w:proofErr w:type="spellStart"/>
+      <w:r>
+        <w:rPr>
+          <w:rFonts w:ascii="Courier New" w:eastAsia="Courier New" w:hAnsi="Courier New" w:cs="Courier New"/>
+          <w:color w:val="334155"/>
+          <w:sz w:val="18"/>
+          <w:szCs w:val="18"/>
+        </w:rPr>
+        <w:t>python</w:t>
+      </w:r>
+      <w:proofErr w:type="spellEnd"/>
+      <w:r>
+        <w:rPr>
+          <w:rFonts w:ascii="Courier New" w:eastAsia="Courier New" w:hAnsi="Courier New" w:cs="Courier New"/>
+          <w:color w:val="334155"/>
+          <w:sz w:val="18"/>
+          <w:szCs w:val="18"/>
+        </w:rPr>
+        <w:t xml:space="preserve"> manage.py </w:t>
+      </w:r>
+      <w:proofErr w:type="spellStart"/>
+      <w:r>
+        <w:rPr>
+          <w:rFonts w:ascii="Courier New" w:eastAsia="Courier New" w:hAnsi="Courier New" w:cs="Courier New"/>
+          <w:color w:val="334155"/>
+          <w:sz w:val="18"/>
+          <w:szCs w:val="18"/>
+        </w:rPr>
+        <w:t>migrate</w:t>
+      </w:r>
+      <w:proofErr w:type="spellEnd"/>
     </w:p>
     <w:p>
       <w:pPr>
@@ -3846,12 +4298,14 @@
         </w:numPr>
         <w:spacing w:before="60" w:after="60"/>
       </w:pPr>
+      <w:proofErr w:type="spellStart"/>
       <w:r>
         <w:rPr>
           <w:color w:val="0F172A"/>
         </w:rPr>
         <w:t>tienda_cliente</w:t>
       </w:r>
+      <w:proofErr w:type="spellEnd"/>
     </w:p>
     <w:p>
       <w:pPr>
@@ -3862,12 +4316,14 @@
         </w:numPr>
         <w:spacing w:before="60" w:after="60"/>
       </w:pPr>
+      <w:proofErr w:type="spellStart"/>
       <w:r>
         <w:rPr>
           <w:color w:val="0F172A"/>
         </w:rPr>
         <w:t>tienda_generojuego</w:t>
       </w:r>
+      <w:proofErr w:type="spellEnd"/>
     </w:p>
     <w:p>
       <w:pPr>
@@ -3878,12 +4334,14 @@
         </w:numPr>
         <w:spacing w:before="60" w:after="60"/>
       </w:pPr>
+      <w:proofErr w:type="spellStart"/>
       <w:r>
         <w:rPr>
           <w:color w:val="0F172A"/>
         </w:rPr>
         <w:t>tienda_plataforma</w:t>
       </w:r>
+      <w:proofErr w:type="spellEnd"/>
     </w:p>
     <w:p>
       <w:pPr>
@@ -3894,12 +4352,14 @@
         </w:numPr>
         <w:spacing w:before="60" w:after="60"/>
       </w:pPr>
+      <w:proofErr w:type="spellStart"/>
       <w:r>
         <w:rPr>
           <w:color w:val="0F172A"/>
         </w:rPr>
         <w:t>tienda_juego</w:t>
       </w:r>
+      <w:proofErr w:type="spellEnd"/>
     </w:p>
     <w:p>
       <w:pPr>
@@ -3910,12 +4370,14 @@
         </w:numPr>
         <w:spacing w:before="60" w:after="60"/>
       </w:pPr>
+      <w:proofErr w:type="spellStart"/>
       <w:r>
         <w:rPr>
           <w:color w:val="0F172A"/>
         </w:rPr>
         <w:t>tienda_boleta</w:t>
       </w:r>
+      <w:proofErr w:type="spellEnd"/>
     </w:p>
     <w:p>
       <w:pPr>
@@ -3926,12 +4388,14 @@
         </w:numPr>
         <w:spacing w:before="60" w:after="60"/>
       </w:pPr>
+      <w:proofErr w:type="spellStart"/>
       <w:r>
         <w:rPr>
           <w:color w:val="0F172A"/>
         </w:rPr>
         <w:t>tienda_detalleboleta</w:t>
       </w:r>
+      <w:proofErr w:type="spellEnd"/>
     </w:p>
     <w:p>
       <w:pPr>
@@ -3980,12 +4444,6 @@
         <w:gridCol w:w="3526"/>
       </w:tblGrid>
       <w:tr>
-        <w:tblPrEx>
-          <w:tblCellMar>
-            <w:top w:w="0" w:type="dxa"/>
-            <w:bottom w:w="0" w:type="dxa"/>
-          </w:tblCellMar>
-        </w:tblPrEx>
         <w:trPr>
           <w:tblHeader/>
         </w:trPr>
@@ -4081,12 +4539,6 @@
         </w:tc>
       </w:tr>
       <w:tr>
-        <w:tblPrEx>
-          <w:tblCellMar>
-            <w:top w:w="0" w:type="dxa"/>
-            <w:bottom w:w="0" w:type="dxa"/>
-          </w:tblCellMar>
-        </w:tblPrEx>
         <w:tc>
           <w:tcPr>
             <w:tcW w:w="2000" w:type="dxa"/>
@@ -4161,6 +4613,7 @@
             </w:tcMar>
           </w:tcPr>
           <w:p>
+            <w:proofErr w:type="spellStart"/>
             <w:r>
               <w:rPr>
                 <w:color w:val="0F172A"/>
@@ -4169,16 +4622,11 @@
               </w:rPr>
               <w:t>listado_clientes</w:t>
             </w:r>
+            <w:proofErr w:type="spellEnd"/>
           </w:p>
         </w:tc>
       </w:tr>
       <w:tr>
-        <w:tblPrEx>
-          <w:tblCellMar>
-            <w:top w:w="0" w:type="dxa"/>
-            <w:bottom w:w="0" w:type="dxa"/>
-          </w:tblCellMar>
-        </w:tblPrEx>
         <w:tc>
           <w:tcPr>
             <w:tcW w:w="2000" w:type="dxa"/>
@@ -4253,6 +4701,7 @@
             </w:tcMar>
           </w:tcPr>
           <w:p>
+            <w:proofErr w:type="spellStart"/>
             <w:r>
               <w:rPr>
                 <w:color w:val="0F172A"/>
@@ -4261,16 +4710,11 @@
               </w:rPr>
               <w:t>crear_cliente</w:t>
             </w:r>
+            <w:proofErr w:type="spellEnd"/>
           </w:p>
         </w:tc>
       </w:tr>
       <w:tr>
-        <w:tblPrEx>
-          <w:tblCellMar>
-            <w:top w:w="0" w:type="dxa"/>
-            <w:bottom w:w="0" w:type="dxa"/>
-          </w:tblCellMar>
-        </w:tblPrEx>
         <w:tc>
           <w:tcPr>
             <w:tcW w:w="2000" w:type="dxa"/>
@@ -4345,6 +4789,7 @@
             </w:tcMar>
           </w:tcPr>
           <w:p>
+            <w:proofErr w:type="spellStart"/>
             <w:r>
               <w:rPr>
                 <w:color w:val="0F172A"/>
@@ -4353,16 +4798,11 @@
               </w:rPr>
               <w:t>editar_cliente</w:t>
             </w:r>
+            <w:proofErr w:type="spellEnd"/>
           </w:p>
         </w:tc>
       </w:tr>
       <w:tr>
-        <w:tblPrEx>
-          <w:tblCellMar>
-            <w:top w:w="0" w:type="dxa"/>
-            <w:bottom w:w="0" w:type="dxa"/>
-          </w:tblCellMar>
-        </w:tblPrEx>
         <w:tc>
           <w:tcPr>
             <w:tcW w:w="2000" w:type="dxa"/>
@@ -4437,6 +4877,7 @@
             </w:tcMar>
           </w:tcPr>
           <w:p>
+            <w:proofErr w:type="spellStart"/>
             <w:r>
               <w:rPr>
                 <w:color w:val="0F172A"/>
@@ -4445,6 +4886,7 @@
               </w:rPr>
               <w:t>eliminar_cliente</w:t>
             </w:r>
+            <w:proofErr w:type="spellEnd"/>
           </w:p>
         </w:tc>
       </w:tr>
@@ -4485,12 +4927,6 @@
         <w:gridCol w:w="3526"/>
       </w:tblGrid>
       <w:tr>
-        <w:tblPrEx>
-          <w:tblCellMar>
-            <w:top w:w="0" w:type="dxa"/>
-            <w:bottom w:w="0" w:type="dxa"/>
-          </w:tblCellMar>
-        </w:tblPrEx>
         <w:trPr>
           <w:tblHeader/>
         </w:trPr>
@@ -4586,12 +5022,6 @@
         </w:tc>
       </w:tr>
       <w:tr>
-        <w:tblPrEx>
-          <w:tblCellMar>
-            <w:top w:w="0" w:type="dxa"/>
-            <w:bottom w:w="0" w:type="dxa"/>
-          </w:tblCellMar>
-        </w:tblPrEx>
         <w:tc>
           <w:tcPr>
             <w:tcW w:w="2000" w:type="dxa"/>
@@ -4616,7 +5046,25 @@
                 <w:sz w:val="20"/>
                 <w:szCs w:val="20"/>
               </w:rPr>
-              <w:t>Listar (admin)</w:t>
+              <w:t>Listar (</w:t>
+            </w:r>
+            <w:proofErr w:type="spellStart"/>
+            <w:r>
+              <w:rPr>
+                <w:color w:val="0F172A"/>
+                <w:sz w:val="20"/>
+                <w:szCs w:val="20"/>
+              </w:rPr>
+              <w:t>admin</w:t>
+            </w:r>
+            <w:proofErr w:type="spellEnd"/>
+            <w:r>
+              <w:rPr>
+                <w:color w:val="0F172A"/>
+                <w:sz w:val="20"/>
+                <w:szCs w:val="20"/>
+              </w:rPr>
+              <w:t>)</w:t>
             </w:r>
           </w:p>
         </w:tc>
@@ -4666,6 +5114,7 @@
             </w:tcMar>
           </w:tcPr>
           <w:p>
+            <w:proofErr w:type="spellStart"/>
             <w:r>
               <w:rPr>
                 <w:color w:val="0F172A"/>
@@ -4674,16 +5123,11 @@
               </w:rPr>
               <w:t>listado_juegos</w:t>
             </w:r>
+            <w:proofErr w:type="spellEnd"/>
           </w:p>
         </w:tc>
       </w:tr>
       <w:tr>
-        <w:tblPrEx>
-          <w:tblCellMar>
-            <w:top w:w="0" w:type="dxa"/>
-            <w:bottom w:w="0" w:type="dxa"/>
-          </w:tblCellMar>
-        </w:tblPrEx>
         <w:tc>
           <w:tcPr>
             <w:tcW w:w="2000" w:type="dxa"/>
@@ -4736,7 +5180,25 @@
                 <w:sz w:val="20"/>
                 <w:szCs w:val="20"/>
               </w:rPr>
-              <w:t>/juego_cliente/</w:t>
+              <w:t>/</w:t>
+            </w:r>
+            <w:proofErr w:type="spellStart"/>
+            <w:r>
+              <w:rPr>
+                <w:color w:val="0F172A"/>
+                <w:sz w:val="20"/>
+                <w:szCs w:val="20"/>
+              </w:rPr>
+              <w:t>juego_cliente</w:t>
+            </w:r>
+            <w:proofErr w:type="spellEnd"/>
+            <w:r>
+              <w:rPr>
+                <w:color w:val="0F172A"/>
+                <w:sz w:val="20"/>
+                <w:szCs w:val="20"/>
+              </w:rPr>
+              <w:t>/</w:t>
             </w:r>
           </w:p>
         </w:tc>
@@ -4758,6 +5220,7 @@
             </w:tcMar>
           </w:tcPr>
           <w:p>
+            <w:proofErr w:type="spellStart"/>
             <w:r>
               <w:rPr>
                 <w:color w:val="0F172A"/>
@@ -4766,16 +5229,11 @@
               </w:rPr>
               <w:t>listado_juegos_cliente</w:t>
             </w:r>
+            <w:proofErr w:type="spellEnd"/>
           </w:p>
         </w:tc>
       </w:tr>
       <w:tr>
-        <w:tblPrEx>
-          <w:tblCellMar>
-            <w:top w:w="0" w:type="dxa"/>
-            <w:bottom w:w="0" w:type="dxa"/>
-          </w:tblCellMar>
-        </w:tblPrEx>
         <w:tc>
           <w:tcPr>
             <w:tcW w:w="2000" w:type="dxa"/>
@@ -4850,6 +5308,7 @@
             </w:tcMar>
           </w:tcPr>
           <w:p>
+            <w:proofErr w:type="spellStart"/>
             <w:r>
               <w:rPr>
                 <w:color w:val="0F172A"/>
@@ -4858,16 +5317,11 @@
               </w:rPr>
               <w:t>crear_juego</w:t>
             </w:r>
+            <w:proofErr w:type="spellEnd"/>
           </w:p>
         </w:tc>
       </w:tr>
       <w:tr>
-        <w:tblPrEx>
-          <w:tblCellMar>
-            <w:top w:w="0" w:type="dxa"/>
-            <w:bottom w:w="0" w:type="dxa"/>
-          </w:tblCellMar>
-        </w:tblPrEx>
         <w:tc>
           <w:tcPr>
             <w:tcW w:w="2000" w:type="dxa"/>
@@ -4942,6 +5396,7 @@
             </w:tcMar>
           </w:tcPr>
           <w:p>
+            <w:proofErr w:type="spellStart"/>
             <w:r>
               <w:rPr>
                 <w:color w:val="0F172A"/>
@@ -4950,16 +5405,11 @@
               </w:rPr>
               <w:t>editar_juego</w:t>
             </w:r>
+            <w:proofErr w:type="spellEnd"/>
           </w:p>
         </w:tc>
       </w:tr>
       <w:tr>
-        <w:tblPrEx>
-          <w:tblCellMar>
-            <w:top w:w="0" w:type="dxa"/>
-            <w:bottom w:w="0" w:type="dxa"/>
-          </w:tblCellMar>
-        </w:tblPrEx>
         <w:tc>
           <w:tcPr>
             <w:tcW w:w="2000" w:type="dxa"/>
@@ -5034,6 +5484,7 @@
             </w:tcMar>
           </w:tcPr>
           <w:p>
+            <w:proofErr w:type="spellStart"/>
             <w:r>
               <w:rPr>
                 <w:color w:val="0F172A"/>
@@ -5042,6 +5493,7 @@
               </w:rPr>
               <w:t>eliminar_juego</w:t>
             </w:r>
+            <w:proofErr w:type="spellEnd"/>
           </w:p>
         </w:tc>
       </w:tr>
@@ -5082,12 +5534,6 @@
         <w:gridCol w:w="3526"/>
       </w:tblGrid>
       <w:tr>
-        <w:tblPrEx>
-          <w:tblCellMar>
-            <w:top w:w="0" w:type="dxa"/>
-            <w:bottom w:w="0" w:type="dxa"/>
-          </w:tblCellMar>
-        </w:tblPrEx>
         <w:trPr>
           <w:tblHeader/>
         </w:trPr>
@@ -5183,12 +5629,6 @@
         </w:tc>
       </w:tr>
       <w:tr>
-        <w:tblPrEx>
-          <w:tblCellMar>
-            <w:top w:w="0" w:type="dxa"/>
-            <w:bottom w:w="0" w:type="dxa"/>
-          </w:tblCellMar>
-        </w:tblPrEx>
         <w:tc>
           <w:tcPr>
             <w:tcW w:w="2000" w:type="dxa"/>
@@ -5263,6 +5703,7 @@
             </w:tcMar>
           </w:tcPr>
           <w:p>
+            <w:proofErr w:type="spellStart"/>
             <w:r>
               <w:rPr>
                 <w:color w:val="0F172A"/>
@@ -5271,16 +5712,11 @@
               </w:rPr>
               <w:t>listado_plataforma</w:t>
             </w:r>
+            <w:proofErr w:type="spellEnd"/>
           </w:p>
         </w:tc>
       </w:tr>
       <w:tr>
-        <w:tblPrEx>
-          <w:tblCellMar>
-            <w:top w:w="0" w:type="dxa"/>
-            <w:bottom w:w="0" w:type="dxa"/>
-          </w:tblCellMar>
-        </w:tblPrEx>
         <w:tc>
           <w:tcPr>
             <w:tcW w:w="2000" w:type="dxa"/>
@@ -5355,6 +5791,7 @@
             </w:tcMar>
           </w:tcPr>
           <w:p>
+            <w:proofErr w:type="spellStart"/>
             <w:r>
               <w:rPr>
                 <w:color w:val="0F172A"/>
@@ -5363,16 +5800,11 @@
               </w:rPr>
               <w:t>crear_plataforma</w:t>
             </w:r>
+            <w:proofErr w:type="spellEnd"/>
           </w:p>
         </w:tc>
       </w:tr>
       <w:tr>
-        <w:tblPrEx>
-          <w:tblCellMar>
-            <w:top w:w="0" w:type="dxa"/>
-            <w:bottom w:w="0" w:type="dxa"/>
-          </w:tblCellMar>
-        </w:tblPrEx>
         <w:tc>
           <w:tcPr>
             <w:tcW w:w="2000" w:type="dxa"/>
@@ -5448,6 +5880,7 @@
             </w:tcMar>
           </w:tcPr>
           <w:p>
+            <w:proofErr w:type="spellStart"/>
             <w:r>
               <w:rPr>
                 <w:color w:val="0F172A"/>
@@ -5456,16 +5889,11 @@
               </w:rPr>
               <w:t>editar_plataforma</w:t>
             </w:r>
+            <w:proofErr w:type="spellEnd"/>
           </w:p>
         </w:tc>
       </w:tr>
       <w:tr>
-        <w:tblPrEx>
-          <w:tblCellMar>
-            <w:top w:w="0" w:type="dxa"/>
-            <w:bottom w:w="0" w:type="dxa"/>
-          </w:tblCellMar>
-        </w:tblPrEx>
         <w:tc>
           <w:tcPr>
             <w:tcW w:w="2000" w:type="dxa"/>
@@ -5540,6 +5968,7 @@
             </w:tcMar>
           </w:tcPr>
           <w:p>
+            <w:proofErr w:type="spellStart"/>
             <w:r>
               <w:rPr>
                 <w:color w:val="0F172A"/>
@@ -5548,6 +5977,7 @@
               </w:rPr>
               <w:t>eliminar_plataforma</w:t>
             </w:r>
+            <w:proofErr w:type="spellEnd"/>
           </w:p>
         </w:tc>
       </w:tr>
@@ -5588,12 +6018,6 @@
         <w:gridCol w:w="3526"/>
       </w:tblGrid>
       <w:tr>
-        <w:tblPrEx>
-          <w:tblCellMar>
-            <w:top w:w="0" w:type="dxa"/>
-            <w:bottom w:w="0" w:type="dxa"/>
-          </w:tblCellMar>
-        </w:tblPrEx>
         <w:trPr>
           <w:tblHeader/>
         </w:trPr>
@@ -5689,12 +6113,6 @@
         </w:tc>
       </w:tr>
       <w:tr>
-        <w:tblPrEx>
-          <w:tblCellMar>
-            <w:top w:w="0" w:type="dxa"/>
-            <w:bottom w:w="0" w:type="dxa"/>
-          </w:tblCellMar>
-        </w:tblPrEx>
         <w:tc>
           <w:tcPr>
             <w:tcW w:w="2000" w:type="dxa"/>
@@ -5769,6 +6187,7 @@
             </w:tcMar>
           </w:tcPr>
           <w:p>
+            <w:proofErr w:type="spellStart"/>
             <w:r>
               <w:rPr>
                 <w:color w:val="0F172A"/>
@@ -5777,16 +6196,11 @@
               </w:rPr>
               <w:t>listado_genero_juego</w:t>
             </w:r>
+            <w:proofErr w:type="spellEnd"/>
           </w:p>
         </w:tc>
       </w:tr>
       <w:tr>
-        <w:tblPrEx>
-          <w:tblCellMar>
-            <w:top w:w="0" w:type="dxa"/>
-            <w:bottom w:w="0" w:type="dxa"/>
-          </w:tblCellMar>
-        </w:tblPrEx>
         <w:tc>
           <w:tcPr>
             <w:tcW w:w="2000" w:type="dxa"/>
@@ -5861,6 +6275,7 @@
             </w:tcMar>
           </w:tcPr>
           <w:p>
+            <w:proofErr w:type="spellStart"/>
             <w:r>
               <w:rPr>
                 <w:color w:val="0F172A"/>
@@ -5869,16 +6284,11 @@
               </w:rPr>
               <w:t>crear_genero_juego</w:t>
             </w:r>
+            <w:proofErr w:type="spellEnd"/>
           </w:p>
         </w:tc>
       </w:tr>
       <w:tr>
-        <w:tblPrEx>
-          <w:tblCellMar>
-            <w:top w:w="0" w:type="dxa"/>
-            <w:bottom w:w="0" w:type="dxa"/>
-          </w:tblCellMar>
-        </w:tblPrEx>
         <w:tc>
           <w:tcPr>
             <w:tcW w:w="2000" w:type="dxa"/>
@@ -5953,6 +6363,7 @@
             </w:tcMar>
           </w:tcPr>
           <w:p>
+            <w:proofErr w:type="spellStart"/>
             <w:r>
               <w:rPr>
                 <w:color w:val="0F172A"/>
@@ -5961,16 +6372,11 @@
               </w:rPr>
               <w:t>editar_genero_juego</w:t>
             </w:r>
+            <w:proofErr w:type="spellEnd"/>
           </w:p>
         </w:tc>
       </w:tr>
       <w:tr>
-        <w:tblPrEx>
-          <w:tblCellMar>
-            <w:top w:w="0" w:type="dxa"/>
-            <w:bottom w:w="0" w:type="dxa"/>
-          </w:tblCellMar>
-        </w:tblPrEx>
         <w:tc>
           <w:tcPr>
             <w:tcW w:w="2000" w:type="dxa"/>
@@ -6045,6 +6451,7 @@
             </w:tcMar>
           </w:tcPr>
           <w:p>
+            <w:proofErr w:type="spellStart"/>
             <w:r>
               <w:rPr>
                 <w:color w:val="0F172A"/>
@@ -6053,6 +6460,7 @@
               </w:rPr>
               <w:t>eliminar_genero_juego</w:t>
             </w:r>
+            <w:proofErr w:type="spellEnd"/>
           </w:p>
         </w:tc>
       </w:tr>
@@ -6180,8 +6588,16 @@
         <w:rPr>
           <w:color w:val="0F172A"/>
         </w:rPr>
-        <w:t>Se crea un registro en Boleta y N registros en DetalleBoleta</w:t>
-      </w:r>
+        <w:t xml:space="preserve">Se crea un registro en Boleta y N registros en </w:t>
+      </w:r>
+      <w:proofErr w:type="spellStart"/>
+      <w:r>
+        <w:rPr>
+          <w:color w:val="0F172A"/>
+        </w:rPr>
+        <w:t>DetalleBoleta</w:t>
+      </w:r>
+      <w:proofErr w:type="spellEnd"/>
     </w:p>
     <w:p>
       <w:pPr>
@@ -6220,7 +6636,21 @@
         <w:rPr>
           <w:color w:val="0F172A"/>
         </w:rPr>
-        <w:t>El carrito se almacena en request.session como un diccionario Python. No requiere tabla en la BD:</w:t>
+        <w:t xml:space="preserve">El carrito se almacena en </w:t>
+      </w:r>
+      <w:proofErr w:type="spellStart"/>
+      <w:r>
+        <w:rPr>
+          <w:color w:val="0F172A"/>
+        </w:rPr>
+        <w:t>request.session</w:t>
+      </w:r>
+      <w:proofErr w:type="spellEnd"/>
+      <w:r>
+        <w:rPr>
+          <w:color w:val="0F172A"/>
+        </w:rPr>
+        <w:t xml:space="preserve"> como un diccionario Python. No requiere tabla en la BD:</w:t>
       </w:r>
     </w:p>
     <w:p>
@@ -6257,15 +6687,9 @@
           <w:sz w:val="18"/>
           <w:szCs w:val="18"/>
         </w:rPr>
-        <w:t xml:space="preserve">    "1": {"nombre": "Doom II", "precio": 20000.0, "cantidad": 2},</w:t>
-      </w:r>
-    </w:p>
-    <w:p>
-      <w:pPr>
-        <w:shd w:val="clear" w:color="auto" w:fill="F1F5F9"/>
-        <w:spacing w:before="80" w:after="80"/>
-        <w:ind w:left="360"/>
-      </w:pPr>
+        <w:t xml:space="preserve">    "1": {"nombre": "</w:t>
+      </w:r>
+      <w:proofErr w:type="spellStart"/>
       <w:r>
         <w:rPr>
           <w:rFonts w:ascii="Courier New" w:eastAsia="Courier New" w:hAnsi="Courier New" w:cs="Courier New"/>
@@ -6273,15 +6697,9 @@
           <w:sz w:val="18"/>
           <w:szCs w:val="18"/>
         </w:rPr>
-        <w:t xml:space="preserve">    "2": {"nombre": "Super Mario", "precio": 45000.0, "cantidad": 1}</w:t>
-      </w:r>
-    </w:p>
-    <w:p>
-      <w:pPr>
-        <w:shd w:val="clear" w:color="auto" w:fill="F1F5F9"/>
-        <w:spacing w:before="80" w:after="80"/>
-        <w:ind w:left="360"/>
-      </w:pPr>
+        <w:t>Doom</w:t>
+      </w:r>
+      <w:proofErr w:type="spellEnd"/>
       <w:r>
         <w:rPr>
           <w:rFonts w:ascii="Courier New" w:eastAsia="Courier New" w:hAnsi="Courier New" w:cs="Courier New"/>
@@ -6289,6 +6707,38 @@
           <w:sz w:val="18"/>
           <w:szCs w:val="18"/>
         </w:rPr>
+        <w:t xml:space="preserve"> II", "precio": 20000.0, "cantidad": 2},</w:t>
+      </w:r>
+    </w:p>
+    <w:p>
+      <w:pPr>
+        <w:shd w:val="clear" w:color="auto" w:fill="F1F5F9"/>
+        <w:spacing w:before="80" w:after="80"/>
+        <w:ind w:left="360"/>
+      </w:pPr>
+      <w:r>
+        <w:rPr>
+          <w:rFonts w:ascii="Courier New" w:eastAsia="Courier New" w:hAnsi="Courier New" w:cs="Courier New"/>
+          <w:color w:val="334155"/>
+          <w:sz w:val="18"/>
+          <w:szCs w:val="18"/>
+        </w:rPr>
+        <w:t xml:space="preserve">    "2": {"nombre": "Super Mario", "precio": 45000.0, "cantidad": 1}</w:t>
+      </w:r>
+    </w:p>
+    <w:p>
+      <w:pPr>
+        <w:shd w:val="clear" w:color="auto" w:fill="F1F5F9"/>
+        <w:spacing w:before="80" w:after="80"/>
+        <w:ind w:left="360"/>
+      </w:pPr>
+      <w:r>
+        <w:rPr>
+          <w:rFonts w:ascii="Courier New" w:eastAsia="Courier New" w:hAnsi="Courier New" w:cs="Courier New"/>
+          <w:color w:val="334155"/>
+          <w:sz w:val="18"/>
+          <w:szCs w:val="18"/>
+        </w:rPr>
         <w:t>}</w:t>
       </w:r>
     </w:p>
@@ -6302,7 +6752,15 @@
         <w:pStyle w:val="Ttulo2"/>
       </w:pPr>
       <w:r>
-        <w:t>6.3 URLs del Carrito</w:t>
+        <w:t xml:space="preserve">6.3 </w:t>
+      </w:r>
+      <w:proofErr w:type="spellStart"/>
+      <w:r>
+        <w:t>URLs</w:t>
+      </w:r>
+      <w:proofErr w:type="spellEnd"/>
+      <w:r>
+        <w:t xml:space="preserve"> del Carrito</w:t>
       </w:r>
     </w:p>
     <w:tbl>
@@ -6328,12 +6786,6 @@
         <w:gridCol w:w="3526"/>
       </w:tblGrid>
       <w:tr>
-        <w:tblPrEx>
-          <w:tblCellMar>
-            <w:top w:w="0" w:type="dxa"/>
-            <w:bottom w:w="0" w:type="dxa"/>
-          </w:tblCellMar>
-        </w:tblPrEx>
         <w:trPr>
           <w:tblHeader/>
         </w:trPr>
@@ -6429,12 +6881,6 @@
         </w:tc>
       </w:tr>
       <w:tr>
-        <w:tblPrEx>
-          <w:tblCellMar>
-            <w:top w:w="0" w:type="dxa"/>
-            <w:bottom w:w="0" w:type="dxa"/>
-          </w:tblCellMar>
-        </w:tblPrEx>
         <w:tc>
           <w:tcPr>
             <w:tcW w:w="2500" w:type="dxa"/>
@@ -6487,7 +6933,25 @@
                 <w:sz w:val="20"/>
                 <w:szCs w:val="20"/>
               </w:rPr>
-              <w:t>/carrito/&lt;id_juego&gt;/</w:t>
+              <w:t>/carrito/&lt;</w:t>
+            </w:r>
+            <w:proofErr w:type="spellStart"/>
+            <w:r>
+              <w:rPr>
+                <w:color w:val="0F172A"/>
+                <w:sz w:val="20"/>
+                <w:szCs w:val="20"/>
+              </w:rPr>
+              <w:t>id_juego</w:t>
+            </w:r>
+            <w:proofErr w:type="spellEnd"/>
+            <w:r>
+              <w:rPr>
+                <w:color w:val="0F172A"/>
+                <w:sz w:val="20"/>
+                <w:szCs w:val="20"/>
+              </w:rPr>
+              <w:t>&gt;/</w:t>
             </w:r>
           </w:p>
         </w:tc>
@@ -6509,6 +6973,7 @@
             </w:tcMar>
           </w:tcPr>
           <w:p>
+            <w:proofErr w:type="spellStart"/>
             <w:r>
               <w:rPr>
                 <w:color w:val="0F172A"/>
@@ -6517,16 +6982,11 @@
               </w:rPr>
               <w:t>crear_carrito</w:t>
             </w:r>
+            <w:proofErr w:type="spellEnd"/>
           </w:p>
         </w:tc>
       </w:tr>
       <w:tr>
-        <w:tblPrEx>
-          <w:tblCellMar>
-            <w:top w:w="0" w:type="dxa"/>
-            <w:bottom w:w="0" w:type="dxa"/>
-          </w:tblCellMar>
-        </w:tblPrEx>
         <w:tc>
           <w:tcPr>
             <w:tcW w:w="2500" w:type="dxa"/>
@@ -6579,7 +7039,25 @@
                 <w:sz w:val="20"/>
                 <w:szCs w:val="20"/>
               </w:rPr>
-              <w:t>/carrito/ver_carrito/</w:t>
+              <w:t>/carrito/</w:t>
+            </w:r>
+            <w:proofErr w:type="spellStart"/>
+            <w:r>
+              <w:rPr>
+                <w:color w:val="0F172A"/>
+                <w:sz w:val="20"/>
+                <w:szCs w:val="20"/>
+              </w:rPr>
+              <w:t>ver_carrito</w:t>
+            </w:r>
+            <w:proofErr w:type="spellEnd"/>
+            <w:r>
+              <w:rPr>
+                <w:color w:val="0F172A"/>
+                <w:sz w:val="20"/>
+                <w:szCs w:val="20"/>
+              </w:rPr>
+              <w:t>/</w:t>
             </w:r>
           </w:p>
         </w:tc>
@@ -6601,6 +7079,7 @@
             </w:tcMar>
           </w:tcPr>
           <w:p>
+            <w:proofErr w:type="spellStart"/>
             <w:r>
               <w:rPr>
                 <w:color w:val="0F172A"/>
@@ -6609,16 +7088,11 @@
               </w:rPr>
               <w:t>ver_carrito</w:t>
             </w:r>
+            <w:proofErr w:type="spellEnd"/>
           </w:p>
         </w:tc>
       </w:tr>
       <w:tr>
-        <w:tblPrEx>
-          <w:tblCellMar>
-            <w:top w:w="0" w:type="dxa"/>
-            <w:bottom w:w="0" w:type="dxa"/>
-          </w:tblCellMar>
-        </w:tblPrEx>
         <w:tc>
           <w:tcPr>
             <w:tcW w:w="2500" w:type="dxa"/>
@@ -6705,12 +7179,6 @@
         </w:tc>
       </w:tr>
       <w:tr>
-        <w:tblPrEx>
-          <w:tblCellMar>
-            <w:top w:w="0" w:type="dxa"/>
-            <w:bottom w:w="0" w:type="dxa"/>
-          </w:tblCellMar>
-        </w:tblPrEx>
         <w:tc>
           <w:tcPr>
             <w:tcW w:w="2500" w:type="dxa"/>
@@ -6797,12 +7265,6 @@
         </w:tc>
       </w:tr>
       <w:tr>
-        <w:tblPrEx>
-          <w:tblCellMar>
-            <w:top w:w="0" w:type="dxa"/>
-            <w:bottom w:w="0" w:type="dxa"/>
-          </w:tblCellMar>
-        </w:tblPrEx>
         <w:tc>
           <w:tcPr>
             <w:tcW w:w="2500" w:type="dxa"/>
@@ -6877,6 +7339,7 @@
             </w:tcMar>
           </w:tcPr>
           <w:p>
+            <w:proofErr w:type="spellStart"/>
             <w:r>
               <w:rPr>
                 <w:color w:val="0F172A"/>
@@ -6885,16 +7348,11 @@
               </w:rPr>
               <w:t>confirmar_compra</w:t>
             </w:r>
+            <w:proofErr w:type="spellEnd"/>
           </w:p>
         </w:tc>
       </w:tr>
       <w:tr>
-        <w:tblPrEx>
-          <w:tblCellMar>
-            <w:top w:w="0" w:type="dxa"/>
-            <w:bottom w:w="0" w:type="dxa"/>
-          </w:tblCellMar>
-        </w:tblPrEx>
         <w:tc>
           <w:tcPr>
             <w:tcW w:w="2500" w:type="dxa"/>
@@ -6969,6 +7427,7 @@
             </w:tcMar>
           </w:tcPr>
           <w:p>
+            <w:proofErr w:type="spellStart"/>
             <w:r>
               <w:rPr>
                 <w:color w:val="0F172A"/>
@@ -6977,16 +7436,11 @@
               </w:rPr>
               <w:t>resumen_boleta</w:t>
             </w:r>
+            <w:proofErr w:type="spellEnd"/>
           </w:p>
         </w:tc>
       </w:tr>
       <w:tr>
-        <w:tblPrEx>
-          <w:tblCellMar>
-            <w:top w:w="0" w:type="dxa"/>
-            <w:bottom w:w="0" w:type="dxa"/>
-          </w:tblCellMar>
-        </w:tblPrEx>
         <w:tc>
           <w:tcPr>
             <w:tcW w:w="2500" w:type="dxa"/>
@@ -7039,8 +7493,18 @@
                 <w:sz w:val="20"/>
                 <w:szCs w:val="20"/>
               </w:rPr>
-              <w:t>/boleta/listado_boleta</w:t>
-            </w:r>
+              <w:t>/boleta/</w:t>
+            </w:r>
+            <w:proofErr w:type="spellStart"/>
+            <w:r>
+              <w:rPr>
+                <w:color w:val="0F172A"/>
+                <w:sz w:val="20"/>
+                <w:szCs w:val="20"/>
+              </w:rPr>
+              <w:t>listado_boleta</w:t>
+            </w:r>
+            <w:proofErr w:type="spellEnd"/>
           </w:p>
         </w:tc>
         <w:tc>
@@ -7061,6 +7525,7 @@
             </w:tcMar>
           </w:tcPr>
           <w:p>
+            <w:proofErr w:type="spellStart"/>
             <w:r>
               <w:rPr>
                 <w:color w:val="0F172A"/>
@@ -7069,6 +7534,7 @@
               </w:rPr>
               <w:t>listado_boleta</w:t>
             </w:r>
+            <w:proofErr w:type="spellEnd"/>
           </w:p>
         </w:tc>
       </w:tr>
@@ -7129,12 +7595,6 @@
         <w:gridCol w:w="9430"/>
       </w:tblGrid>
       <w:tr>
-        <w:tblPrEx>
-          <w:tblCellMar>
-            <w:top w:w="0" w:type="dxa"/>
-            <w:bottom w:w="0" w:type="dxa"/>
-          </w:tblCellMar>
-        </w:tblPrEx>
         <w:tc>
           <w:tcPr>
             <w:tcW w:w="9026" w:type="dxa"/>
@@ -7160,6 +7620,7 @@
               <w:rPr>
                 <w:i/>
                 <w:iCs/>
+                <w:noProof/>
                 <w:color w:val="64748B"/>
               </w:rPr>
               <w:drawing>
@@ -7256,12 +7717,6 @@
         <w:gridCol w:w="9430"/>
       </w:tblGrid>
       <w:tr>
-        <w:tblPrEx>
-          <w:tblCellMar>
-            <w:top w:w="0" w:type="dxa"/>
-            <w:bottom w:w="0" w:type="dxa"/>
-          </w:tblCellMar>
-        </w:tblPrEx>
         <w:tc>
           <w:tcPr>
             <w:tcW w:w="9026" w:type="dxa"/>
@@ -7284,6 +7739,9 @@
               <w:jc w:val="center"/>
             </w:pPr>
             <w:r>
+              <w:rPr>
+                <w:noProof/>
+              </w:rPr>
               <w:drawing>
                 <wp:inline distT="0" distB="0" distL="0" distR="0" wp14:anchorId="3EBCA4D7" wp14:editId="660CB215">
                   <wp:extent cx="5731510" cy="3222625"/>
@@ -7363,12 +7821,6 @@
         <w:gridCol w:w="9430"/>
       </w:tblGrid>
       <w:tr>
-        <w:tblPrEx>
-          <w:tblCellMar>
-            <w:top w:w="0" w:type="dxa"/>
-            <w:bottom w:w="0" w:type="dxa"/>
-          </w:tblCellMar>
-        </w:tblPrEx>
         <w:tc>
           <w:tcPr>
             <w:tcW w:w="9026" w:type="dxa"/>
@@ -7391,6 +7843,9 @@
               <w:jc w:val="center"/>
             </w:pPr>
             <w:r>
+              <w:rPr>
+                <w:noProof/>
+              </w:rPr>
               <w:drawing>
                 <wp:inline distT="0" distB="0" distL="0" distR="0" wp14:anchorId="4537F210" wp14:editId="0E4E19FF">
                   <wp:extent cx="5731510" cy="1661160"/>
@@ -7438,6 +7893,9 @@
               <w:jc w:val="center"/>
             </w:pPr>
             <w:r>
+              <w:rPr>
+                <w:noProof/>
+              </w:rPr>
               <w:lastRenderedPageBreak/>
               <w:drawing>
                 <wp:inline distT="0" distB="0" distL="0" distR="0" wp14:anchorId="6528EB63" wp14:editId="6DDB322B">
@@ -7518,12 +7976,6 @@
         <w:gridCol w:w="9430"/>
       </w:tblGrid>
       <w:tr>
-        <w:tblPrEx>
-          <w:tblCellMar>
-            <w:top w:w="0" w:type="dxa"/>
-            <w:bottom w:w="0" w:type="dxa"/>
-          </w:tblCellMar>
-        </w:tblPrEx>
         <w:tc>
           <w:tcPr>
             <w:tcW w:w="9026" w:type="dxa"/>
@@ -7543,6 +7995,9 @@
           </w:tcPr>
           <w:p>
             <w:r>
+              <w:rPr>
+                <w:noProof/>
+              </w:rPr>
               <w:drawing>
                 <wp:inline distT="0" distB="0" distL="0" distR="0" wp14:anchorId="50C7E7D3" wp14:editId="20157121">
                   <wp:extent cx="5731510" cy="3207385"/>
@@ -7622,12 +8077,6 @@
         <w:gridCol w:w="9430"/>
       </w:tblGrid>
       <w:tr>
-        <w:tblPrEx>
-          <w:tblCellMar>
-            <w:top w:w="0" w:type="dxa"/>
-            <w:bottom w:w="0" w:type="dxa"/>
-          </w:tblCellMar>
-        </w:tblPrEx>
         <w:tc>
           <w:tcPr>
             <w:tcW w:w="9026" w:type="dxa"/>
@@ -7653,6 +8102,7 @@
               <w:rPr>
                 <w:i/>
                 <w:iCs/>
+                <w:noProof/>
                 <w:color w:val="64748B"/>
               </w:rPr>
               <w:drawing>
@@ -7734,12 +8184,6 @@
         <w:gridCol w:w="9430"/>
       </w:tblGrid>
       <w:tr>
-        <w:tblPrEx>
-          <w:tblCellMar>
-            <w:top w:w="0" w:type="dxa"/>
-            <w:bottom w:w="0" w:type="dxa"/>
-          </w:tblCellMar>
-        </w:tblPrEx>
         <w:tc>
           <w:tcPr>
             <w:tcW w:w="9026" w:type="dxa"/>
@@ -7762,6 +8206,9 @@
               <w:jc w:val="center"/>
             </w:pPr>
             <w:r>
+              <w:rPr>
+                <w:noProof/>
+              </w:rPr>
               <w:drawing>
                 <wp:inline distT="0" distB="0" distL="0" distR="0" wp14:anchorId="22A5A937" wp14:editId="48595F26">
                   <wp:extent cx="5731510" cy="3621405"/>
@@ -7807,6 +8254,7 @@
               <w:rPr>
                 <w:i/>
                 <w:iCs/>
+                <w:noProof/>
                 <w:color w:val="64748B"/>
               </w:rPr>
               <w:lastRenderedPageBreak/>
@@ -7889,12 +8337,6 @@
         <w:gridCol w:w="9430"/>
       </w:tblGrid>
       <w:tr>
-        <w:tblPrEx>
-          <w:tblCellMar>
-            <w:top w:w="0" w:type="dxa"/>
-            <w:bottom w:w="0" w:type="dxa"/>
-          </w:tblCellMar>
-        </w:tblPrEx>
         <w:tc>
           <w:tcPr>
             <w:tcW w:w="9026" w:type="dxa"/>
@@ -7925,6 +8367,7 @@
               <w:rPr>
                 <w:i/>
                 <w:iCs/>
+                <w:noProof/>
                 <w:color w:val="64748B"/>
               </w:rPr>
               <w:drawing>
@@ -7972,6 +8415,7 @@
               <w:rPr>
                 <w:i/>
                 <w:iCs/>
+                <w:noProof/>
                 <w:color w:val="64748B"/>
               </w:rPr>
               <w:lastRenderedPageBreak/>
@@ -8022,6 +8466,9 @@
               <w:jc w:val="center"/>
             </w:pPr>
             <w:r>
+              <w:rPr>
+                <w:noProof/>
+              </w:rPr>
               <w:drawing>
                 <wp:inline distT="0" distB="0" distL="0" distR="0" wp14:anchorId="1A0BABB2" wp14:editId="4CC6838F">
                   <wp:extent cx="5731510" cy="3787140"/>
@@ -8072,8 +8519,13 @@
         <w:pStyle w:val="Ttulo2"/>
       </w:pPr>
       <w:r>
-        <w:t>7.8 Base de Datos en DBeaver</w:t>
-      </w:r>
+        <w:t xml:space="preserve">7.8 Base de Datos en </w:t>
+      </w:r>
+      <w:proofErr w:type="spellStart"/>
+      <w:r>
+        <w:t>DBeaver</w:t>
+      </w:r>
+      <w:proofErr w:type="spellEnd"/>
     </w:p>
     <w:p>
       <w:pPr>
@@ -8101,12 +8553,6 @@
         <w:gridCol w:w="9430"/>
       </w:tblGrid>
       <w:tr>
-        <w:tblPrEx>
-          <w:tblCellMar>
-            <w:top w:w="0" w:type="dxa"/>
-            <w:bottom w:w="0" w:type="dxa"/>
-          </w:tblCellMar>
-        </w:tblPrEx>
         <w:tc>
           <w:tcPr>
             <w:tcW w:w="9026" w:type="dxa"/>
@@ -8132,6 +8578,7 @@
               <w:rPr>
                 <w:i/>
                 <w:iCs/>
+                <w:noProof/>
                 <w:color w:val="64748B"/>
               </w:rPr>
               <w:lastRenderedPageBreak/>
@@ -8182,6 +8629,9 @@
               <w:jc w:val="center"/>
             </w:pPr>
             <w:r>
+              <w:rPr>
+                <w:noProof/>
+              </w:rPr>
               <w:drawing>
                 <wp:inline distT="0" distB="0" distL="0" distR="0" wp14:anchorId="4648471C" wp14:editId="5DDCCD32">
                   <wp:extent cx="5731510" cy="1758315"/>
@@ -8229,6 +8679,9 @@
               <w:jc w:val="center"/>
             </w:pPr>
             <w:r>
+              <w:rPr>
+                <w:noProof/>
+              </w:rPr>
               <w:drawing>
                 <wp:inline distT="0" distB="0" distL="0" distR="0" wp14:anchorId="38156D5E" wp14:editId="29117FFF">
                   <wp:extent cx="5731510" cy="1520825"/>
@@ -8276,6 +8729,9 @@
               <w:jc w:val="center"/>
             </w:pPr>
             <w:r>
+              <w:rPr>
+                <w:noProof/>
+              </w:rPr>
               <w:lastRenderedPageBreak/>
               <w:drawing>
                 <wp:inline distT="0" distB="0" distL="0" distR="0" wp14:anchorId="4CCCB439" wp14:editId="642ABC42">
@@ -8368,7 +8824,25 @@
         <w:sz w:val="18"/>
         <w:szCs w:val="18"/>
       </w:rPr>
-      <w:t xml:space="preserve">Alejandro Villa  |  Alkemy  |  Pág. </w:t>
+      <w:t xml:space="preserve">Alejandro Villa  |  </w:t>
+    </w:r>
+    <w:proofErr w:type="spellStart"/>
+    <w:r>
+      <w:rPr>
+        <w:color w:val="64748B"/>
+        <w:sz w:val="18"/>
+        <w:szCs w:val="18"/>
+      </w:rPr>
+      <w:t>Alkemy</w:t>
+    </w:r>
+    <w:proofErr w:type="spellEnd"/>
+    <w:r>
+      <w:rPr>
+        <w:color w:val="64748B"/>
+        <w:sz w:val="18"/>
+        <w:szCs w:val="18"/>
+      </w:rPr>
+      <w:t xml:space="preserve">  |  Pág. </w:t>
     </w:r>
     <w:r>
       <w:fldChar w:fldCharType="begin"/>
@@ -8419,6 +8893,7 @@
         <w:bottom w:val="single" w:sz="4" w:space="4" w:color="6366F1"/>
       </w:pBdr>
     </w:pPr>
+    <w:proofErr w:type="spellStart"/>
     <w:r>
       <w:rPr>
         <w:b/>
@@ -8427,6 +8902,7 @@
       </w:rPr>
       <w:t>GameStore</w:t>
     </w:r>
+    <w:proofErr w:type="spellEnd"/>
     <w:r>
       <w:rPr>
         <w:color w:val="64748B"/>
@@ -9083,6 +9559,7 @@
   <w:style w:type="character" w:default="1" w:styleId="Fuentedeprrafopredeter">
     <w:name w:val="Default Paragraph Font"/>
     <w:uiPriority w:val="1"/>
+    <w:semiHidden/>
     <w:unhideWhenUsed/>
   </w:style>
   <w:style w:type="table" w:default="1" w:styleId="Tablanormal">

</xml_diff>